<commit_message>
Actualizacion de documentacion y diagramas ATEDA
</commit_message>
<xml_diff>
--- a/Fase_2/Evidencias Proyecto/Documento 01- Product Vision.docx
+++ b/Fase_2/Evidencias Proyecto/Documento 01- Product Vision.docx
@@ -5,7 +5,7 @@
     <w:sdt>
       <w:sdtPr>
         <w:rPr>
-          <w:rFonts w:eastAsiaTheme="majorEastAsia"/>
+          <w:rFonts w:ascii="Arial" w:eastAsiaTheme="majorEastAsia" w:hAnsi="Arial" w:cs="Arial"/>
           <w:b/>
           <w:bCs/>
           <w:color w:val="1F497D" w:themeColor="text2"/>
@@ -18,7 +18,7 @@
       </w:sdtPr>
       <w:sdtEndPr>
         <w:rPr>
-          <w:rFonts w:eastAsiaTheme="minorHAnsi" w:cstheme="minorHAnsi"/>
+          <w:rFonts w:eastAsiaTheme="minorHAnsi"/>
           <w:b w:val="0"/>
           <w:bCs w:val="0"/>
           <w:sz w:val="32"/>
@@ -42,7 +42,7 @@
             <w:sdt>
               <w:sdtPr>
                 <w:rPr>
-                  <w:rFonts w:eastAsiaTheme="majorEastAsia"/>
+                  <w:rFonts w:ascii="Arial" w:eastAsiaTheme="majorEastAsia" w:hAnsi="Arial" w:cs="Arial"/>
                   <w:b/>
                   <w:bCs/>
                   <w:color w:val="1F497D" w:themeColor="text2"/>
@@ -70,18 +70,20 @@
                   <w:p>
                     <w:pPr>
                       <w:rPr>
-                        <w:rFonts w:eastAsiaTheme="majorEastAsia"/>
+                        <w:rFonts w:ascii="Arial" w:eastAsiaTheme="majorEastAsia" w:hAnsi="Arial" w:cs="Arial"/>
                         <w:color w:val="1F497D" w:themeColor="text2"/>
                       </w:rPr>
                     </w:pPr>
                     <w:r>
                       <w:rPr>
+                        <w:rFonts w:ascii="Arial" w:hAnsi="Arial" w:cs="Arial"/>
                         <w:color w:val="1F497D" w:themeColor="text2"/>
                       </w:rPr>
                       <w:t>DUOC UC - Escuela de informá</w:t>
                     </w:r>
                     <w:r>
                       <w:rPr>
+                        <w:rFonts w:ascii="Arial" w:hAnsi="Arial" w:cs="Arial"/>
                         <w:color w:val="1F497D" w:themeColor="text2"/>
                       </w:rPr>
                       <w:t>tica y telecomunicaciones</w:t>
@@ -99,7 +101,7 @@
             <w:sdt>
               <w:sdtPr>
                 <w:rPr>
-                  <w:rFonts w:eastAsiaTheme="majorEastAsia" w:cstheme="minorHAnsi"/>
+                  <w:rFonts w:ascii="Arial" w:eastAsiaTheme="majorEastAsia" w:hAnsi="Arial" w:cs="Arial"/>
                   <w:color w:val="1F497D" w:themeColor="text2"/>
                   <w:sz w:val="80"/>
                   <w:szCs w:val="80"/>
@@ -126,7 +128,7 @@
                       <w:pStyle w:val="Sinespaciado"/>
                       <w:jc w:val="center"/>
                       <w:rPr>
-                        <w:rFonts w:eastAsiaTheme="majorEastAsia" w:cstheme="minorHAnsi"/>
+                        <w:rFonts w:ascii="Arial" w:eastAsiaTheme="majorEastAsia" w:hAnsi="Arial" w:cs="Arial"/>
                         <w:color w:val="1F497D" w:themeColor="text2"/>
                         <w:sz w:val="80"/>
                         <w:szCs w:val="80"/>
@@ -134,7 +136,7 @@
                     </w:pPr>
                     <w:r>
                       <w:rPr>
-                        <w:rFonts w:eastAsiaTheme="majorEastAsia" w:cstheme="minorHAnsi"/>
+                        <w:rFonts w:ascii="Arial" w:eastAsiaTheme="majorEastAsia" w:hAnsi="Arial" w:cs="Arial"/>
                         <w:color w:val="1F497D" w:themeColor="text2"/>
                         <w:sz w:val="80"/>
                         <w:szCs w:val="80"/>
@@ -154,9 +156,9 @@
             <w:sdt>
               <w:sdtPr>
                 <w:rPr>
-                  <w:rFonts w:eastAsiaTheme="majorEastAsia" w:cstheme="minorHAnsi"/>
-                  <w:iCs/>
-                  <w:color w:val="1F497D" w:themeColor="text2"/>
+                  <w:rFonts w:ascii="Arial" w:eastAsiaTheme="majorEastAsia" w:hAnsi="Arial" w:cs="Arial"/>
+                  <w:i/>
+                  <w:color w:val="365F91" w:themeColor="accent1" w:themeShade="BF"/>
                   <w:sz w:val="44"/>
                   <w:szCs w:val="44"/>
                   <w:lang w:val="es-AR"/>
@@ -180,7 +182,7 @@
                       <w:pStyle w:val="Sinespaciado"/>
                       <w:jc w:val="center"/>
                       <w:rPr>
-                        <w:rFonts w:eastAsiaTheme="majorEastAsia" w:cstheme="minorHAnsi"/>
+                        <w:rFonts w:ascii="Arial" w:eastAsiaTheme="majorEastAsia" w:hAnsi="Arial" w:cs="Arial"/>
                         <w:color w:val="1F497D" w:themeColor="text2"/>
                         <w:sz w:val="44"/>
                         <w:szCs w:val="44"/>
@@ -188,14 +190,14 @@
                     </w:pPr>
                     <w:r>
                       <w:rPr>
-                        <w:rFonts w:eastAsiaTheme="majorEastAsia" w:cstheme="minorHAnsi"/>
-                        <w:iCs/>
-                        <w:color w:val="1F497D" w:themeColor="text2"/>
+                        <w:rFonts w:ascii="Arial" w:eastAsiaTheme="majorEastAsia" w:hAnsi="Arial" w:cs="Arial"/>
+                        <w:i/>
+                        <w:color w:val="365F91" w:themeColor="accent1" w:themeShade="BF"/>
                         <w:sz w:val="44"/>
                         <w:szCs w:val="44"/>
                         <w:lang w:val="es-AR"/>
                       </w:rPr>
-                      <w:t>ATEDA</w:t>
+                      <w:t>ATEDA – Sistema de alerta temprana para la identificación de estudiantes con posibles dificultades del aprendizaje</w:t>
                     </w:r>
                   </w:p>
                 </w:tc>
@@ -217,7 +219,7 @@
                   <w:pStyle w:val="Sinespaciado"/>
                   <w:jc w:val="center"/>
                   <w:rPr>
-                    <w:rFonts w:cstheme="minorHAnsi"/>
+                    <w:rFonts w:ascii="Arial" w:hAnsi="Arial" w:cs="Arial"/>
                     <w:color w:val="1F497D" w:themeColor="text2"/>
                   </w:rPr>
                 </w:pPr>
@@ -239,7 +241,7 @@
                   <w:pStyle w:val="Sinespaciado"/>
                   <w:jc w:val="center"/>
                   <w:rPr>
-                    <w:rFonts w:cstheme="minorHAnsi"/>
+                    <w:rFonts w:ascii="Arial" w:hAnsi="Arial" w:cs="Arial"/>
                     <w:b/>
                     <w:bCs/>
                     <w:color w:val="1F497D" w:themeColor="text2"/>
@@ -247,7 +249,7 @@
                 </w:pPr>
                 <w:r>
                   <w:rPr>
-                    <w:rFonts w:cstheme="minorHAnsi"/>
+                    <w:rFonts w:ascii="Arial" w:hAnsi="Arial" w:cs="Arial"/>
                     <w:b/>
                     <w:bCs/>
                     <w:color w:val="1F497D" w:themeColor="text2"/>
@@ -256,7 +258,7 @@
                 </w:r>
                 <w:r>
                   <w:rPr>
-                    <w:rFonts w:cstheme="minorHAnsi"/>
+                    <w:rFonts w:ascii="Arial" w:hAnsi="Arial" w:cs="Arial"/>
                     <w:b/>
                     <w:bCs/>
                     <w:i/>
@@ -266,7 +268,7 @@
                 </w:r>
                 <w:r>
                   <w:rPr>
-                    <w:rFonts w:cstheme="minorHAnsi"/>
+                    <w:rFonts w:ascii="Arial" w:hAnsi="Arial" w:cs="Arial"/>
                     <w:b/>
                     <w:bCs/>
                     <w:iCs/>
@@ -276,7 +278,7 @@
                 </w:r>
                 <w:r>
                   <w:rPr>
-                    <w:rFonts w:cstheme="minorHAnsi"/>
+                    <w:rFonts w:ascii="Arial" w:hAnsi="Arial" w:cs="Arial"/>
                     <w:b/>
                     <w:bCs/>
                     <w:iCs/>
@@ -286,7 +288,7 @@
                 </w:r>
                 <w:r>
                   <w:rPr>
-                    <w:rFonts w:cstheme="minorHAnsi"/>
+                    <w:rFonts w:ascii="Arial" w:hAnsi="Arial" w:cs="Arial"/>
                     <w:b/>
                     <w:bCs/>
                     <w:iCs/>
@@ -305,7 +307,7 @@
             <w:sdt>
               <w:sdtPr>
                 <w:rPr>
-                  <w:rFonts w:cstheme="minorHAnsi"/>
+                  <w:rFonts w:ascii="Arial" w:hAnsi="Arial" w:cs="Arial"/>
                   <w:b/>
                   <w:bCs/>
                   <w:color w:val="1F497D" w:themeColor="text2"/>
@@ -331,7 +333,7 @@
                       <w:pStyle w:val="Sinespaciado"/>
                       <w:jc w:val="center"/>
                       <w:rPr>
-                        <w:rFonts w:cstheme="minorHAnsi"/>
+                        <w:rFonts w:ascii="Arial" w:hAnsi="Arial" w:cs="Arial"/>
                         <w:b/>
                         <w:bCs/>
                         <w:color w:val="1F497D" w:themeColor="text2"/>
@@ -339,7 +341,7 @@
                     </w:pPr>
                     <w:r>
                       <w:rPr>
-                        <w:rFonts w:cstheme="minorHAnsi"/>
+                        <w:rFonts w:ascii="Arial" w:hAnsi="Arial" w:cs="Arial"/>
                         <w:b/>
                         <w:bCs/>
                         <w:color w:val="1F497D" w:themeColor="text2"/>
@@ -355,7 +357,7 @@
         <w:p>
           <w:pPr>
             <w:rPr>
-              <w:rFonts w:cstheme="minorHAnsi"/>
+              <w:rFonts w:ascii="Arial" w:hAnsi="Arial" w:cs="Arial"/>
               <w:color w:val="1F497D" w:themeColor="text2"/>
               <w:lang w:val="es-ES"/>
             </w:rPr>
@@ -364,7 +366,7 @@
         <w:p>
           <w:pPr>
             <w:rPr>
-              <w:rFonts w:cstheme="minorHAnsi"/>
+              <w:rFonts w:ascii="Arial" w:hAnsi="Arial" w:cs="Arial"/>
               <w:color w:val="1F497D" w:themeColor="text2"/>
               <w:lang w:val="es-ES"/>
             </w:rPr>
@@ -383,7 +385,7 @@
             <w:sdt>
               <w:sdtPr>
                 <w:rPr>
-                  <w:rFonts w:eastAsiaTheme="minorHAnsi" w:cstheme="minorHAnsi"/>
+                  <w:rFonts w:ascii="Arial" w:eastAsiaTheme="minorHAnsi" w:hAnsi="Arial" w:cs="Arial"/>
                   <w:color w:val="1F497D" w:themeColor="text2"/>
                   <w:lang w:val="es-AR"/>
                 </w:rPr>
@@ -401,13 +403,13 @@
                     <w:pPr>
                       <w:pStyle w:val="Sinespaciado"/>
                       <w:rPr>
-                        <w:rFonts w:cstheme="minorHAnsi"/>
+                        <w:rFonts w:ascii="Arial" w:hAnsi="Arial" w:cs="Arial"/>
                         <w:color w:val="1F497D" w:themeColor="text2"/>
                       </w:rPr>
                     </w:pPr>
                     <w:r>
                       <w:rPr>
-                        <w:rFonts w:eastAsiaTheme="minorHAnsi" w:cstheme="minorHAnsi"/>
+                        <w:rFonts w:ascii="Arial" w:eastAsiaTheme="minorHAnsi" w:hAnsi="Arial" w:cs="Arial"/>
                         <w:color w:val="1F497D" w:themeColor="text2"/>
                         <w:lang w:val="es-AR"/>
                       </w:rPr>
@@ -415,7 +417,7 @@
                     </w:r>
                     <w:r>
                       <w:rPr>
-                        <w:rFonts w:eastAsiaTheme="minorHAnsi" w:cstheme="minorHAnsi"/>
+                        <w:rFonts w:ascii="Arial" w:eastAsiaTheme="minorHAnsi" w:hAnsi="Arial" w:cs="Arial"/>
                         <w:color w:val="1F497D" w:themeColor="text2"/>
                         <w:lang w:val="es-AR"/>
                       </w:rPr>
@@ -423,7 +425,7 @@
                     </w:r>
                     <w:r>
                       <w:rPr>
-                        <w:rFonts w:eastAsiaTheme="minorHAnsi" w:cstheme="minorHAnsi"/>
+                        <w:rFonts w:ascii="Arial" w:eastAsiaTheme="minorHAnsi" w:hAnsi="Arial" w:cs="Arial"/>
                         <w:color w:val="1F497D" w:themeColor="text2"/>
                         <w:lang w:val="es-AR"/>
                       </w:rPr>
@@ -431,7 +433,7 @@
                     </w:r>
                     <w:r>
                       <w:rPr>
-                        <w:rFonts w:eastAsiaTheme="minorHAnsi" w:cstheme="minorHAnsi"/>
+                        <w:rFonts w:ascii="Arial" w:eastAsiaTheme="minorHAnsi" w:hAnsi="Arial" w:cs="Arial"/>
                         <w:color w:val="1F497D" w:themeColor="text2"/>
                         <w:lang w:val="es-AR"/>
                       </w:rPr>
@@ -439,7 +441,7 @@
                     </w:r>
                     <w:r>
                       <w:rPr>
-                        <w:rFonts w:eastAsiaTheme="minorHAnsi" w:cstheme="minorHAnsi"/>
+                        <w:rFonts w:ascii="Arial" w:eastAsiaTheme="minorHAnsi" w:hAnsi="Arial" w:cs="Arial"/>
                         <w:color w:val="1F497D" w:themeColor="text2"/>
                         <w:lang w:val="es-AR"/>
                       </w:rPr>
@@ -447,7 +449,7 @@
                     </w:r>
                     <w:r>
                       <w:rPr>
-                        <w:rFonts w:eastAsiaTheme="minorHAnsi" w:cstheme="minorHAnsi"/>
+                        <w:rFonts w:ascii="Arial" w:eastAsiaTheme="minorHAnsi" w:hAnsi="Arial" w:cs="Arial"/>
                         <w:color w:val="1F497D" w:themeColor="text2"/>
                         <w:lang w:val="es-AR"/>
                       </w:rPr>
@@ -462,7 +464,7 @@
         <w:p>
           <w:pPr>
             <w:rPr>
-              <w:rFonts w:cstheme="minorHAnsi"/>
+              <w:rFonts w:ascii="Arial" w:hAnsi="Arial" w:cs="Arial"/>
               <w:color w:val="1F497D" w:themeColor="text2"/>
               <w:lang w:val="es-ES"/>
             </w:rPr>
@@ -471,14 +473,14 @@
         <w:p>
           <w:pPr>
             <w:rPr>
-              <w:rFonts w:cstheme="minorHAnsi"/>
+              <w:rFonts w:ascii="Arial" w:hAnsi="Arial" w:cs="Arial"/>
               <w:color w:val="1F497D" w:themeColor="text2"/>
               <w:sz w:val="32"/>
             </w:rPr>
           </w:pPr>
           <w:r>
             <w:rPr>
-              <w:rFonts w:cstheme="minorHAnsi"/>
+              <w:rFonts w:ascii="Arial" w:hAnsi="Arial" w:cs="Arial"/>
               <w:color w:val="1F497D" w:themeColor="text2"/>
               <w:sz w:val="32"/>
             </w:rPr>
@@ -489,1109 +491,933 @@
     </w:sdt>
     <w:p>
       <w:pPr>
-        <w:spacing w:after="0" w:line="240" w:lineRule="auto"/>
+        <w:spacing w:after="0"/>
         <w:jc w:val="both"/>
         <w:rPr>
-          <w:rFonts w:cstheme="minorHAnsi"/>
-          <w:color w:val="1F497D" w:themeColor="text2"/>
-          <w:sz w:val="32"/>
-        </w:rPr>
-      </w:pPr>
+          <w:rFonts w:ascii="Arial" w:hAnsi="Arial" w:cs="Arial"/>
+          <w:b/>
+          <w:bCs/>
+          <w:color w:val="1F497D" w:themeColor="text2"/>
+          <w:sz w:val="28"/>
+          <w:szCs w:val="28"/>
+        </w:rPr>
+      </w:pPr>
+      <w:r>
+        <w:rPr>
+          <w:rFonts w:ascii="Arial" w:hAnsi="Arial" w:cs="Arial"/>
+          <w:b/>
+          <w:bCs/>
+          <w:color w:val="1F497D" w:themeColor="text2"/>
+          <w:sz w:val="28"/>
+          <w:szCs w:val="28"/>
+        </w:rPr>
+        <w:lastRenderedPageBreak/>
+        <w:t>Índice de contenidos</w:t>
+      </w:r>
     </w:p>
     <w:p>
       <w:pPr>
         <w:spacing w:after="0"/>
         <w:jc w:val="both"/>
         <w:rPr>
-          <w:rFonts w:eastAsiaTheme="majorEastAsia" w:cstheme="minorHAnsi"/>
-          <w:b/>
-          <w:bCs/>
-          <w:color w:val="1F497D" w:themeColor="text2"/>
-          <w:sz w:val="28"/>
-          <w:szCs w:val="28"/>
-        </w:rPr>
-      </w:pPr>
+          <w:rFonts w:ascii="Arial" w:hAnsi="Arial" w:cs="Arial"/>
+          <w:color w:val="1F497D" w:themeColor="text2"/>
+        </w:rPr>
+      </w:pPr>
+      <w:r>
+        <w:rPr>
+          <w:rFonts w:ascii="Arial" w:hAnsi="Arial" w:cs="Arial"/>
+          <w:color w:val="1F497D" w:themeColor="text2"/>
+        </w:rPr>
+        <w:t>1 Ficha del Documento…………………………………………………………………….………2</w:t>
+      </w:r>
     </w:p>
-    <w:sdt>
-      <w:sdtPr>
-        <w:rPr>
-          <w:rFonts w:asciiTheme="minorHAnsi" w:eastAsiaTheme="minorHAnsi" w:hAnsiTheme="minorHAnsi" w:cstheme="minorHAnsi"/>
-          <w:b w:val="0"/>
-          <w:bCs w:val="0"/>
-          <w:color w:val="1F497D" w:themeColor="text2"/>
-          <w:sz w:val="22"/>
-          <w:szCs w:val="22"/>
-          <w:lang w:val="es-AR"/>
-        </w:rPr>
-        <w:id w:val="1371383"/>
-        <w:docPartObj>
-          <w:docPartGallery w:val="Table of Contents"/>
-          <w:docPartUnique/>
-        </w:docPartObj>
-      </w:sdtPr>
-      <w:sdtContent>
-        <w:p>
-          <w:pPr>
-            <w:pStyle w:val="TtuloTDC"/>
-            <w:jc w:val="both"/>
-            <w:rPr>
-              <w:rFonts w:asciiTheme="minorHAnsi" w:hAnsiTheme="minorHAnsi" w:cstheme="minorHAnsi"/>
-              <w:color w:val="1F497D" w:themeColor="text2"/>
-            </w:rPr>
-          </w:pPr>
-          <w:r>
-            <w:rPr>
-              <w:rFonts w:asciiTheme="minorHAnsi" w:hAnsiTheme="minorHAnsi" w:cstheme="minorHAnsi"/>
-              <w:color w:val="1F497D" w:themeColor="text2"/>
-            </w:rPr>
-            <w:t>Contenido</w:t>
-          </w:r>
-        </w:p>
-        <w:p>
-          <w:pPr>
-            <w:pStyle w:val="TDC1"/>
-            <w:tabs>
-              <w:tab w:val="left" w:pos="440"/>
-              <w:tab w:val="right" w:leader="dot" w:pos="8828"/>
-            </w:tabs>
-            <w:rPr>
-              <w:rFonts w:eastAsiaTheme="minorEastAsia"/>
-              <w:b w:val="0"/>
-              <w:bCs w:val="0"/>
-              <w:caps w:val="0"/>
-              <w:noProof/>
-              <w:color w:val="1F497D" w:themeColor="text2"/>
-              <w:kern w:val="2"/>
-              <w:sz w:val="24"/>
-              <w:szCs w:val="24"/>
-              <w:lang w:val="es-CL" w:eastAsia="es-MX"/>
-              <w14:ligatures w14:val="standardContextual"/>
-            </w:rPr>
-          </w:pPr>
-          <w:r>
-            <w:rPr>
-              <w:rFonts w:cstheme="minorHAnsi"/>
-              <w:i/>
-              <w:iCs/>
-              <w:color w:val="1F497D" w:themeColor="text2"/>
-              <w:lang w:val="es-ES"/>
-            </w:rPr>
-            <w:fldChar w:fldCharType="begin"/>
-          </w:r>
-          <w:r>
-            <w:rPr>
-              <w:rFonts w:cstheme="minorHAnsi"/>
-              <w:color w:val="1F497D" w:themeColor="text2"/>
-              <w:lang w:val="es-ES"/>
-            </w:rPr>
-            <w:instrText xml:space="preserve"> TOC \o "1-3" \h \z \u </w:instrText>
-          </w:r>
-          <w:r>
-            <w:rPr>
-              <w:rFonts w:cstheme="minorHAnsi"/>
-              <w:i/>
-              <w:iCs/>
-              <w:color w:val="1F497D" w:themeColor="text2"/>
-              <w:lang w:val="es-ES"/>
-            </w:rPr>
-            <w:fldChar w:fldCharType="separate"/>
-          </w:r>
-          <w:hyperlink w:anchor="_Toc241503854" w:history="1">
-            <w:r>
-              <w:rPr>
-                <w:rStyle w:val="Hipervnculo"/>
-                <w:rFonts w:eastAsia="Times New Roman" w:cstheme="minorHAnsi"/>
-                <w:noProof/>
-                <w:color w:val="1F497D" w:themeColor="text2"/>
-                <w:kern w:val="32"/>
-              </w:rPr>
-              <w:t>2</w:t>
-            </w:r>
-            <w:r>
-              <w:rPr>
-                <w:rFonts w:eastAsiaTheme="minorEastAsia"/>
-                <w:b w:val="0"/>
-                <w:bCs w:val="0"/>
-                <w:caps w:val="0"/>
-                <w:noProof/>
-                <w:color w:val="1F497D" w:themeColor="text2"/>
-                <w:kern w:val="2"/>
-                <w:sz w:val="24"/>
-                <w:szCs w:val="24"/>
-                <w:lang w:val="es-CL" w:eastAsia="es-MX"/>
-                <w14:ligatures w14:val="standardContextual"/>
-              </w:rPr>
-              <w:tab/>
-            </w:r>
-            <w:r>
-              <w:rPr>
-                <w:rStyle w:val="Hipervnculo"/>
-                <w:rFonts w:eastAsia="Times New Roman" w:cstheme="minorHAnsi"/>
-                <w:noProof/>
-                <w:color w:val="1F497D" w:themeColor="text2"/>
-                <w:kern w:val="32"/>
-              </w:rPr>
-              <w:t>Ficha del documento</w:t>
-            </w:r>
-            <w:r>
-              <w:rPr>
-                <w:noProof/>
-                <w:webHidden/>
-                <w:color w:val="1F497D" w:themeColor="text2"/>
-              </w:rPr>
-              <w:tab/>
-            </w:r>
-            <w:r>
-              <w:rPr>
-                <w:noProof/>
-                <w:webHidden/>
-                <w:color w:val="1F497D" w:themeColor="text2"/>
-              </w:rPr>
-              <w:fldChar w:fldCharType="begin"/>
-            </w:r>
-            <w:r>
-              <w:rPr>
-                <w:noProof/>
-                <w:webHidden/>
-                <w:color w:val="1F497D" w:themeColor="text2"/>
-              </w:rPr>
-              <w:instrText xml:space="preserve"> PAGEREF _Toc241503854 \h </w:instrText>
-            </w:r>
-            <w:r>
-              <w:rPr>
-                <w:noProof/>
-                <w:webHidden/>
-                <w:color w:val="1F497D" w:themeColor="text2"/>
-              </w:rPr>
-            </w:r>
-            <w:r>
-              <w:rPr>
-                <w:noProof/>
-                <w:webHidden/>
-                <w:color w:val="1F497D" w:themeColor="text2"/>
-              </w:rPr>
-              <w:fldChar w:fldCharType="separate"/>
-            </w:r>
-            <w:r>
-              <w:rPr>
-                <w:noProof/>
-                <w:webHidden/>
-                <w:color w:val="1F497D" w:themeColor="text2"/>
-              </w:rPr>
-              <w:t>2</w:t>
-            </w:r>
-            <w:r>
-              <w:rPr>
-                <w:noProof/>
-                <w:webHidden/>
-                <w:color w:val="1F497D" w:themeColor="text2"/>
-              </w:rPr>
-              <w:fldChar w:fldCharType="end"/>
-            </w:r>
-          </w:hyperlink>
-        </w:p>
-        <w:p>
-          <w:pPr>
-            <w:pStyle w:val="TDC1"/>
-            <w:tabs>
-              <w:tab w:val="left" w:pos="440"/>
-              <w:tab w:val="right" w:leader="dot" w:pos="8828"/>
-            </w:tabs>
-            <w:rPr>
-              <w:rFonts w:eastAsiaTheme="minorEastAsia"/>
-              <w:b w:val="0"/>
-              <w:bCs w:val="0"/>
-              <w:caps w:val="0"/>
-              <w:noProof/>
-              <w:color w:val="1F497D" w:themeColor="text2"/>
-              <w:kern w:val="2"/>
-              <w:sz w:val="24"/>
-              <w:szCs w:val="24"/>
-              <w:lang w:val="es-CL" w:eastAsia="es-MX"/>
-              <w14:ligatures w14:val="standardContextual"/>
-            </w:rPr>
-          </w:pPr>
-          <w:hyperlink w:anchor="_Toc241503855" w:history="1">
-            <w:r>
-              <w:rPr>
-                <w:rStyle w:val="Hipervnculo"/>
-                <w:noProof/>
-                <w:color w:val="1F497D" w:themeColor="text2"/>
-              </w:rPr>
-              <w:t>3</w:t>
-            </w:r>
-            <w:r>
-              <w:rPr>
-                <w:rFonts w:eastAsiaTheme="minorEastAsia"/>
-                <w:b w:val="0"/>
-                <w:bCs w:val="0"/>
-                <w:caps w:val="0"/>
-                <w:noProof/>
-                <w:color w:val="1F497D" w:themeColor="text2"/>
-                <w:kern w:val="2"/>
-                <w:sz w:val="24"/>
-                <w:szCs w:val="24"/>
-                <w:lang w:val="es-CL" w:eastAsia="es-MX"/>
-                <w14:ligatures w14:val="standardContextual"/>
-              </w:rPr>
-              <w:tab/>
-            </w:r>
-            <w:r>
-              <w:rPr>
-                <w:rStyle w:val="Hipervnculo"/>
-                <w:noProof/>
-                <w:color w:val="1F497D" w:themeColor="text2"/>
-              </w:rPr>
-              <w:t>Integrantes:</w:t>
-            </w:r>
-            <w:r>
-              <w:rPr>
-                <w:noProof/>
-                <w:webHidden/>
-                <w:color w:val="1F497D" w:themeColor="text2"/>
-              </w:rPr>
-              <w:tab/>
-            </w:r>
-            <w:r>
-              <w:rPr>
-                <w:noProof/>
-                <w:webHidden/>
-                <w:color w:val="1F497D" w:themeColor="text2"/>
-              </w:rPr>
-              <w:fldChar w:fldCharType="begin"/>
-            </w:r>
-            <w:r>
-              <w:rPr>
-                <w:noProof/>
-                <w:webHidden/>
-                <w:color w:val="1F497D" w:themeColor="text2"/>
-              </w:rPr>
-              <w:instrText xml:space="preserve"> PAGEREF _Toc241503855 \h </w:instrText>
-            </w:r>
-            <w:r>
-              <w:rPr>
-                <w:noProof/>
-                <w:webHidden/>
-                <w:color w:val="1F497D" w:themeColor="text2"/>
-              </w:rPr>
-            </w:r>
-            <w:r>
-              <w:rPr>
-                <w:noProof/>
-                <w:webHidden/>
-                <w:color w:val="1F497D" w:themeColor="text2"/>
-              </w:rPr>
-              <w:fldChar w:fldCharType="separate"/>
-            </w:r>
-            <w:r>
-              <w:rPr>
-                <w:noProof/>
-                <w:webHidden/>
-                <w:color w:val="1F497D" w:themeColor="text2"/>
-              </w:rPr>
-              <w:t>2</w:t>
-            </w:r>
-            <w:r>
-              <w:rPr>
-                <w:noProof/>
-                <w:webHidden/>
-                <w:color w:val="1F497D" w:themeColor="text2"/>
-              </w:rPr>
-              <w:fldChar w:fldCharType="end"/>
-            </w:r>
-          </w:hyperlink>
-        </w:p>
-        <w:p>
-          <w:pPr>
-            <w:pStyle w:val="TDC1"/>
-            <w:tabs>
-              <w:tab w:val="left" w:pos="440"/>
-              <w:tab w:val="right" w:leader="dot" w:pos="8828"/>
-            </w:tabs>
-            <w:rPr>
-              <w:rFonts w:eastAsiaTheme="minorEastAsia"/>
-              <w:b w:val="0"/>
-              <w:bCs w:val="0"/>
-              <w:caps w:val="0"/>
-              <w:noProof/>
-              <w:color w:val="1F497D" w:themeColor="text2"/>
-              <w:kern w:val="2"/>
-              <w:sz w:val="24"/>
-              <w:szCs w:val="24"/>
-              <w:lang w:val="es-CL" w:eastAsia="es-MX"/>
-              <w14:ligatures w14:val="standardContextual"/>
-            </w:rPr>
-          </w:pPr>
-          <w:hyperlink w:anchor="_Toc241503856" w:history="1">
-            <w:r>
-              <w:rPr>
-                <w:rStyle w:val="Hipervnculo"/>
-                <w:rFonts w:cstheme="minorHAnsi"/>
-                <w:noProof/>
-                <w:color w:val="1F497D" w:themeColor="text2"/>
-              </w:rPr>
-              <w:t>4</w:t>
-            </w:r>
-            <w:r>
-              <w:rPr>
-                <w:rFonts w:eastAsiaTheme="minorEastAsia"/>
-                <w:b w:val="0"/>
-                <w:bCs w:val="0"/>
-                <w:caps w:val="0"/>
-                <w:noProof/>
-                <w:color w:val="1F497D" w:themeColor="text2"/>
-                <w:kern w:val="2"/>
-                <w:sz w:val="24"/>
-                <w:szCs w:val="24"/>
-                <w:lang w:val="es-CL" w:eastAsia="es-MX"/>
-                <w14:ligatures w14:val="standardContextual"/>
-              </w:rPr>
-              <w:tab/>
-            </w:r>
-            <w:r>
-              <w:rPr>
-                <w:rStyle w:val="Hipervnculo"/>
-                <w:rFonts w:cstheme="minorHAnsi"/>
-                <w:noProof/>
-                <w:color w:val="1F497D" w:themeColor="text2"/>
-              </w:rPr>
-              <w:t>Producto Vision</w:t>
-            </w:r>
-            <w:r>
-              <w:rPr>
-                <w:noProof/>
-                <w:webHidden/>
-                <w:color w:val="1F497D" w:themeColor="text2"/>
-              </w:rPr>
-              <w:tab/>
-            </w:r>
-            <w:r>
-              <w:rPr>
-                <w:noProof/>
-                <w:webHidden/>
-                <w:color w:val="1F497D" w:themeColor="text2"/>
-              </w:rPr>
-              <w:fldChar w:fldCharType="begin"/>
-            </w:r>
-            <w:r>
-              <w:rPr>
-                <w:noProof/>
-                <w:webHidden/>
-                <w:color w:val="1F497D" w:themeColor="text2"/>
-              </w:rPr>
-              <w:instrText xml:space="preserve"> PAGEREF _Toc241503856 \h </w:instrText>
-            </w:r>
-            <w:r>
-              <w:rPr>
-                <w:noProof/>
-                <w:webHidden/>
-                <w:color w:val="1F497D" w:themeColor="text2"/>
-              </w:rPr>
-            </w:r>
-            <w:r>
-              <w:rPr>
-                <w:noProof/>
-                <w:webHidden/>
-                <w:color w:val="1F497D" w:themeColor="text2"/>
-              </w:rPr>
-              <w:fldChar w:fldCharType="separate"/>
-            </w:r>
-            <w:r>
-              <w:rPr>
-                <w:noProof/>
-                <w:webHidden/>
-                <w:color w:val="1F497D" w:themeColor="text2"/>
-              </w:rPr>
-              <w:t>4</w:t>
-            </w:r>
-            <w:r>
-              <w:rPr>
-                <w:noProof/>
-                <w:webHidden/>
-                <w:color w:val="1F497D" w:themeColor="text2"/>
-              </w:rPr>
-              <w:fldChar w:fldCharType="end"/>
-            </w:r>
-          </w:hyperlink>
-        </w:p>
-        <w:p>
-          <w:pPr>
-            <w:pStyle w:val="TDC2"/>
-            <w:tabs>
-              <w:tab w:val="left" w:pos="880"/>
-              <w:tab w:val="right" w:leader="dot" w:pos="8828"/>
-            </w:tabs>
-            <w:rPr>
-              <w:rFonts w:eastAsiaTheme="minorEastAsia"/>
-              <w:smallCaps w:val="0"/>
-              <w:noProof/>
-              <w:color w:val="1F497D" w:themeColor="text2"/>
-              <w:kern w:val="2"/>
-              <w:sz w:val="24"/>
-              <w:szCs w:val="24"/>
-              <w:lang w:val="es-CL" w:eastAsia="es-MX"/>
-              <w14:ligatures w14:val="standardContextual"/>
-            </w:rPr>
-          </w:pPr>
-          <w:hyperlink w:anchor="_Toc241503857" w:history="1">
-            <w:r>
-              <w:rPr>
-                <w:rStyle w:val="Hipervnculo"/>
-                <w:rFonts w:cstheme="minorHAnsi"/>
-                <w:noProof/>
-                <w:color w:val="1F497D" w:themeColor="text2"/>
-              </w:rPr>
-              <w:t>4.1</w:t>
-            </w:r>
-            <w:r>
-              <w:rPr>
-                <w:rFonts w:eastAsiaTheme="minorEastAsia"/>
-                <w:smallCaps w:val="0"/>
-                <w:noProof/>
-                <w:color w:val="1F497D" w:themeColor="text2"/>
-                <w:kern w:val="2"/>
-                <w:sz w:val="24"/>
-                <w:szCs w:val="24"/>
-                <w:lang w:val="es-CL" w:eastAsia="es-MX"/>
-                <w14:ligatures w14:val="standardContextual"/>
-              </w:rPr>
-              <w:tab/>
-            </w:r>
-            <w:r>
-              <w:rPr>
-                <w:rStyle w:val="Hipervnculo"/>
-                <w:rFonts w:cstheme="minorHAnsi"/>
-                <w:noProof/>
-                <w:color w:val="1F497D" w:themeColor="text2"/>
-              </w:rPr>
-              <w:t>¿Cuál es el problema?</w:t>
-            </w:r>
-            <w:r>
-              <w:rPr>
-                <w:noProof/>
-                <w:webHidden/>
-                <w:color w:val="1F497D" w:themeColor="text2"/>
-              </w:rPr>
-              <w:tab/>
-            </w:r>
-            <w:r>
-              <w:rPr>
-                <w:noProof/>
-                <w:webHidden/>
-                <w:color w:val="1F497D" w:themeColor="text2"/>
-              </w:rPr>
-              <w:fldChar w:fldCharType="begin"/>
-            </w:r>
-            <w:r>
-              <w:rPr>
-                <w:noProof/>
-                <w:webHidden/>
-                <w:color w:val="1F497D" w:themeColor="text2"/>
-              </w:rPr>
-              <w:instrText xml:space="preserve"> PAGEREF _Toc241503857 \h </w:instrText>
-            </w:r>
-            <w:r>
-              <w:rPr>
-                <w:noProof/>
-                <w:webHidden/>
-                <w:color w:val="1F497D" w:themeColor="text2"/>
-              </w:rPr>
-            </w:r>
-            <w:r>
-              <w:rPr>
-                <w:noProof/>
-                <w:webHidden/>
-                <w:color w:val="1F497D" w:themeColor="text2"/>
-              </w:rPr>
-              <w:fldChar w:fldCharType="separate"/>
-            </w:r>
-            <w:r>
-              <w:rPr>
-                <w:noProof/>
-                <w:webHidden/>
-                <w:color w:val="1F497D" w:themeColor="text2"/>
-              </w:rPr>
-              <w:t>4</w:t>
-            </w:r>
-            <w:r>
-              <w:rPr>
-                <w:noProof/>
-                <w:webHidden/>
-                <w:color w:val="1F497D" w:themeColor="text2"/>
-              </w:rPr>
-              <w:fldChar w:fldCharType="end"/>
-            </w:r>
-          </w:hyperlink>
-        </w:p>
-        <w:p>
-          <w:pPr>
-            <w:pStyle w:val="TDC2"/>
-            <w:tabs>
-              <w:tab w:val="left" w:pos="880"/>
-              <w:tab w:val="right" w:leader="dot" w:pos="8828"/>
-            </w:tabs>
-            <w:rPr>
-              <w:rFonts w:eastAsiaTheme="minorEastAsia"/>
-              <w:smallCaps w:val="0"/>
-              <w:noProof/>
-              <w:color w:val="1F497D" w:themeColor="text2"/>
-              <w:kern w:val="2"/>
-              <w:sz w:val="24"/>
-              <w:szCs w:val="24"/>
-              <w:lang w:val="es-CL" w:eastAsia="es-MX"/>
-              <w14:ligatures w14:val="standardContextual"/>
-            </w:rPr>
-          </w:pPr>
-          <w:hyperlink w:anchor="_Toc241503858" w:history="1">
-            <w:r>
-              <w:rPr>
-                <w:rStyle w:val="Hipervnculo"/>
-                <w:noProof/>
-                <w:color w:val="1F497D" w:themeColor="text2"/>
-              </w:rPr>
-              <w:t>4.2</w:t>
-            </w:r>
-            <w:r>
-              <w:rPr>
-                <w:rFonts w:eastAsiaTheme="minorEastAsia"/>
-                <w:smallCaps w:val="0"/>
-                <w:noProof/>
-                <w:color w:val="1F497D" w:themeColor="text2"/>
-                <w:kern w:val="2"/>
-                <w:sz w:val="24"/>
-                <w:szCs w:val="24"/>
-                <w:lang w:val="es-CL" w:eastAsia="es-MX"/>
-                <w14:ligatures w14:val="standardContextual"/>
-              </w:rPr>
-              <w:tab/>
-            </w:r>
-            <w:r>
-              <w:rPr>
-                <w:rStyle w:val="Hipervnculo"/>
-                <w:noProof/>
-                <w:color w:val="1F497D" w:themeColor="text2"/>
-              </w:rPr>
-              <w:t>Usuarios</w:t>
-            </w:r>
-            <w:r>
-              <w:rPr>
-                <w:noProof/>
-                <w:webHidden/>
-                <w:color w:val="1F497D" w:themeColor="text2"/>
-              </w:rPr>
-              <w:tab/>
-            </w:r>
-            <w:r>
-              <w:rPr>
-                <w:noProof/>
-                <w:webHidden/>
-                <w:color w:val="1F497D" w:themeColor="text2"/>
-              </w:rPr>
-              <w:fldChar w:fldCharType="begin"/>
-            </w:r>
-            <w:r>
-              <w:rPr>
-                <w:noProof/>
-                <w:webHidden/>
-                <w:color w:val="1F497D" w:themeColor="text2"/>
-              </w:rPr>
-              <w:instrText xml:space="preserve"> PAGEREF _Toc241503858 \h </w:instrText>
-            </w:r>
-            <w:r>
-              <w:rPr>
-                <w:noProof/>
-                <w:webHidden/>
-                <w:color w:val="1F497D" w:themeColor="text2"/>
-              </w:rPr>
-            </w:r>
-            <w:r>
-              <w:rPr>
-                <w:noProof/>
-                <w:webHidden/>
-                <w:color w:val="1F497D" w:themeColor="text2"/>
-              </w:rPr>
-              <w:fldChar w:fldCharType="separate"/>
-            </w:r>
-            <w:r>
-              <w:rPr>
-                <w:noProof/>
-                <w:webHidden/>
-                <w:color w:val="1F497D" w:themeColor="text2"/>
-              </w:rPr>
-              <w:t>4</w:t>
-            </w:r>
-            <w:r>
-              <w:rPr>
-                <w:noProof/>
-                <w:webHidden/>
-                <w:color w:val="1F497D" w:themeColor="text2"/>
-              </w:rPr>
-              <w:fldChar w:fldCharType="end"/>
-            </w:r>
-          </w:hyperlink>
-        </w:p>
-        <w:p>
-          <w:pPr>
-            <w:pStyle w:val="TDC3"/>
-            <w:tabs>
-              <w:tab w:val="left" w:pos="1320"/>
-              <w:tab w:val="right" w:leader="dot" w:pos="8828"/>
-            </w:tabs>
-            <w:rPr>
-              <w:rFonts w:eastAsiaTheme="minorEastAsia"/>
-              <w:i w:val="0"/>
-              <w:iCs w:val="0"/>
-              <w:noProof/>
-              <w:color w:val="1F497D" w:themeColor="text2"/>
-              <w:kern w:val="2"/>
-              <w:sz w:val="24"/>
-              <w:szCs w:val="24"/>
-              <w:lang w:val="es-CL" w:eastAsia="es-MX"/>
-              <w14:ligatures w14:val="standardContextual"/>
-            </w:rPr>
-          </w:pPr>
-          <w:hyperlink w:anchor="_Toc241503859" w:history="1">
-            <w:r>
-              <w:rPr>
-                <w:rStyle w:val="Hipervnculo"/>
-                <w:noProof/>
-                <w:color w:val="1F497D" w:themeColor="text2"/>
-              </w:rPr>
-              <w:t>4.2.1</w:t>
-            </w:r>
-            <w:r>
-              <w:rPr>
-                <w:rFonts w:eastAsiaTheme="minorEastAsia"/>
-                <w:i w:val="0"/>
-                <w:iCs w:val="0"/>
-                <w:noProof/>
-                <w:color w:val="1F497D" w:themeColor="text2"/>
-                <w:kern w:val="2"/>
-                <w:sz w:val="24"/>
-                <w:szCs w:val="24"/>
-                <w:lang w:val="es-CL" w:eastAsia="es-MX"/>
-                <w14:ligatures w14:val="standardContextual"/>
-              </w:rPr>
-              <w:tab/>
-            </w:r>
-            <w:r>
-              <w:rPr>
-                <w:rStyle w:val="Hipervnculo"/>
-                <w:noProof/>
-                <w:color w:val="1F497D" w:themeColor="text2"/>
-              </w:rPr>
-              <w:t>Psicopedagoga/o</w:t>
-            </w:r>
-            <w:r>
-              <w:rPr>
-                <w:noProof/>
-                <w:webHidden/>
-                <w:color w:val="1F497D" w:themeColor="text2"/>
-              </w:rPr>
-              <w:tab/>
-            </w:r>
-            <w:r>
-              <w:rPr>
-                <w:noProof/>
-                <w:webHidden/>
-                <w:color w:val="1F497D" w:themeColor="text2"/>
-              </w:rPr>
-              <w:fldChar w:fldCharType="begin"/>
-            </w:r>
-            <w:r>
-              <w:rPr>
-                <w:noProof/>
-                <w:webHidden/>
-                <w:color w:val="1F497D" w:themeColor="text2"/>
-              </w:rPr>
-              <w:instrText xml:space="preserve"> PAGEREF _Toc241503859 \h </w:instrText>
-            </w:r>
-            <w:r>
-              <w:rPr>
-                <w:noProof/>
-                <w:webHidden/>
-                <w:color w:val="1F497D" w:themeColor="text2"/>
-              </w:rPr>
-            </w:r>
-            <w:r>
-              <w:rPr>
-                <w:noProof/>
-                <w:webHidden/>
-                <w:color w:val="1F497D" w:themeColor="text2"/>
-              </w:rPr>
-              <w:fldChar w:fldCharType="separate"/>
-            </w:r>
-            <w:r>
-              <w:rPr>
-                <w:noProof/>
-                <w:webHidden/>
-                <w:color w:val="1F497D" w:themeColor="text2"/>
-              </w:rPr>
-              <w:t>4</w:t>
-            </w:r>
-            <w:r>
-              <w:rPr>
-                <w:noProof/>
-                <w:webHidden/>
-                <w:color w:val="1F497D" w:themeColor="text2"/>
-              </w:rPr>
-              <w:fldChar w:fldCharType="end"/>
-            </w:r>
-          </w:hyperlink>
-        </w:p>
-        <w:p>
-          <w:pPr>
-            <w:pStyle w:val="TDC3"/>
-            <w:tabs>
-              <w:tab w:val="left" w:pos="1320"/>
-              <w:tab w:val="right" w:leader="dot" w:pos="8828"/>
-            </w:tabs>
-            <w:rPr>
-              <w:rFonts w:eastAsiaTheme="minorEastAsia"/>
-              <w:i w:val="0"/>
-              <w:iCs w:val="0"/>
-              <w:noProof/>
-              <w:color w:val="1F497D" w:themeColor="text2"/>
-              <w:kern w:val="2"/>
-              <w:sz w:val="24"/>
-              <w:szCs w:val="24"/>
-              <w:lang w:val="es-CL" w:eastAsia="es-MX"/>
-              <w14:ligatures w14:val="standardContextual"/>
-            </w:rPr>
-          </w:pPr>
-          <w:hyperlink w:anchor="_Toc241503860" w:history="1">
-            <w:r>
-              <w:rPr>
-                <w:rStyle w:val="Hipervnculo"/>
-                <w:noProof/>
-                <w:color w:val="1F497D" w:themeColor="text2"/>
-              </w:rPr>
-              <w:t>4.2.2</w:t>
-            </w:r>
-            <w:r>
-              <w:rPr>
-                <w:rFonts w:eastAsiaTheme="minorEastAsia"/>
-                <w:i w:val="0"/>
-                <w:iCs w:val="0"/>
-                <w:noProof/>
-                <w:color w:val="1F497D" w:themeColor="text2"/>
-                <w:kern w:val="2"/>
-                <w:sz w:val="24"/>
-                <w:szCs w:val="24"/>
-                <w:lang w:val="es-CL" w:eastAsia="es-MX"/>
-                <w14:ligatures w14:val="standardContextual"/>
-              </w:rPr>
-              <w:tab/>
-            </w:r>
-            <w:r>
-              <w:rPr>
-                <w:rStyle w:val="Hipervnculo"/>
-                <w:noProof/>
-                <w:color w:val="1F497D" w:themeColor="text2"/>
-              </w:rPr>
-              <w:t>Docente</w:t>
-            </w:r>
-            <w:r>
-              <w:rPr>
-                <w:noProof/>
-                <w:webHidden/>
-                <w:color w:val="1F497D" w:themeColor="text2"/>
-              </w:rPr>
-              <w:tab/>
-            </w:r>
-            <w:r>
-              <w:rPr>
-                <w:noProof/>
-                <w:webHidden/>
-                <w:color w:val="1F497D" w:themeColor="text2"/>
-              </w:rPr>
-              <w:fldChar w:fldCharType="begin"/>
-            </w:r>
-            <w:r>
-              <w:rPr>
-                <w:noProof/>
-                <w:webHidden/>
-                <w:color w:val="1F497D" w:themeColor="text2"/>
-              </w:rPr>
-              <w:instrText xml:space="preserve"> PAGEREF _Toc241503860 \h </w:instrText>
-            </w:r>
-            <w:r>
-              <w:rPr>
-                <w:noProof/>
-                <w:webHidden/>
-                <w:color w:val="1F497D" w:themeColor="text2"/>
-              </w:rPr>
-            </w:r>
-            <w:r>
-              <w:rPr>
-                <w:noProof/>
-                <w:webHidden/>
-                <w:color w:val="1F497D" w:themeColor="text2"/>
-              </w:rPr>
-              <w:fldChar w:fldCharType="separate"/>
-            </w:r>
-            <w:r>
-              <w:rPr>
-                <w:noProof/>
-                <w:webHidden/>
-                <w:color w:val="1F497D" w:themeColor="text2"/>
-              </w:rPr>
-              <w:t>4</w:t>
-            </w:r>
-            <w:r>
-              <w:rPr>
-                <w:noProof/>
-                <w:webHidden/>
-                <w:color w:val="1F497D" w:themeColor="text2"/>
-              </w:rPr>
-              <w:fldChar w:fldCharType="end"/>
-            </w:r>
-          </w:hyperlink>
-        </w:p>
-        <w:p>
-          <w:pPr>
-            <w:pStyle w:val="TDC3"/>
-            <w:tabs>
-              <w:tab w:val="left" w:pos="1320"/>
-              <w:tab w:val="right" w:leader="dot" w:pos="8828"/>
-            </w:tabs>
-            <w:rPr>
-              <w:rFonts w:eastAsiaTheme="minorEastAsia"/>
-              <w:i w:val="0"/>
-              <w:iCs w:val="0"/>
-              <w:noProof/>
-              <w:color w:val="1F497D" w:themeColor="text2"/>
-              <w:kern w:val="2"/>
-              <w:sz w:val="24"/>
-              <w:szCs w:val="24"/>
-              <w:lang w:val="es-CL" w:eastAsia="es-MX"/>
-              <w14:ligatures w14:val="standardContextual"/>
-            </w:rPr>
-          </w:pPr>
-          <w:hyperlink w:anchor="_Toc241503861" w:history="1">
-            <w:r>
-              <w:rPr>
-                <w:rStyle w:val="Hipervnculo"/>
-                <w:noProof/>
-                <w:color w:val="1F497D" w:themeColor="text2"/>
-              </w:rPr>
-              <w:t>4.2.3</w:t>
-            </w:r>
-            <w:r>
-              <w:rPr>
-                <w:rFonts w:eastAsiaTheme="minorEastAsia"/>
-                <w:i w:val="0"/>
-                <w:iCs w:val="0"/>
-                <w:noProof/>
-                <w:color w:val="1F497D" w:themeColor="text2"/>
-                <w:kern w:val="2"/>
-                <w:sz w:val="24"/>
-                <w:szCs w:val="24"/>
-                <w:lang w:val="es-CL" w:eastAsia="es-MX"/>
-                <w14:ligatures w14:val="standardContextual"/>
-              </w:rPr>
-              <w:tab/>
-            </w:r>
-            <w:r>
-              <w:rPr>
-                <w:rStyle w:val="Hipervnculo"/>
-                <w:noProof/>
-                <w:color w:val="1F497D" w:themeColor="text2"/>
-              </w:rPr>
-              <w:t>Equipo de gestión del establecimiento</w:t>
-            </w:r>
-            <w:r>
-              <w:rPr>
-                <w:noProof/>
-                <w:webHidden/>
-                <w:color w:val="1F497D" w:themeColor="text2"/>
-              </w:rPr>
-              <w:tab/>
-            </w:r>
-            <w:r>
-              <w:rPr>
-                <w:noProof/>
-                <w:webHidden/>
-                <w:color w:val="1F497D" w:themeColor="text2"/>
-              </w:rPr>
-              <w:fldChar w:fldCharType="begin"/>
-            </w:r>
-            <w:r>
-              <w:rPr>
-                <w:noProof/>
-                <w:webHidden/>
-                <w:color w:val="1F497D" w:themeColor="text2"/>
-              </w:rPr>
-              <w:instrText xml:space="preserve"> PAGEREF _Toc241503861 \h </w:instrText>
-            </w:r>
-            <w:r>
-              <w:rPr>
-                <w:noProof/>
-                <w:webHidden/>
-                <w:color w:val="1F497D" w:themeColor="text2"/>
-              </w:rPr>
-            </w:r>
-            <w:r>
-              <w:rPr>
-                <w:noProof/>
-                <w:webHidden/>
-                <w:color w:val="1F497D" w:themeColor="text2"/>
-              </w:rPr>
-              <w:fldChar w:fldCharType="separate"/>
-            </w:r>
-            <w:r>
-              <w:rPr>
-                <w:noProof/>
-                <w:webHidden/>
-                <w:color w:val="1F497D" w:themeColor="text2"/>
-              </w:rPr>
-              <w:t>4</w:t>
-            </w:r>
-            <w:r>
-              <w:rPr>
-                <w:noProof/>
-                <w:webHidden/>
-                <w:color w:val="1F497D" w:themeColor="text2"/>
-              </w:rPr>
-              <w:fldChar w:fldCharType="end"/>
-            </w:r>
-          </w:hyperlink>
-        </w:p>
-        <w:p>
-          <w:pPr>
-            <w:pStyle w:val="TDC2"/>
-            <w:tabs>
-              <w:tab w:val="left" w:pos="880"/>
-              <w:tab w:val="right" w:leader="dot" w:pos="8828"/>
-            </w:tabs>
-            <w:rPr>
-              <w:rFonts w:eastAsiaTheme="minorEastAsia"/>
-              <w:smallCaps w:val="0"/>
-              <w:noProof/>
-              <w:color w:val="1F497D" w:themeColor="text2"/>
-              <w:kern w:val="2"/>
-              <w:sz w:val="24"/>
-              <w:szCs w:val="24"/>
-              <w:lang w:val="es-CL" w:eastAsia="es-MX"/>
-              <w14:ligatures w14:val="standardContextual"/>
-            </w:rPr>
-          </w:pPr>
-          <w:hyperlink w:anchor="_Toc241503862" w:history="1">
-            <w:r>
-              <w:rPr>
-                <w:rStyle w:val="Hipervnculo"/>
-                <w:noProof/>
-                <w:color w:val="1F497D" w:themeColor="text2"/>
-                <w:lang w:val="es-ES" w:eastAsia="es-ES"/>
-              </w:rPr>
-              <w:t>4.3</w:t>
-            </w:r>
-            <w:r>
-              <w:rPr>
-                <w:rFonts w:eastAsiaTheme="minorEastAsia"/>
-                <w:smallCaps w:val="0"/>
-                <w:noProof/>
-                <w:color w:val="1F497D" w:themeColor="text2"/>
-                <w:kern w:val="2"/>
-                <w:sz w:val="24"/>
-                <w:szCs w:val="24"/>
-                <w:lang w:val="es-CL" w:eastAsia="es-MX"/>
-                <w14:ligatures w14:val="standardContextual"/>
-              </w:rPr>
-              <w:tab/>
-            </w:r>
-            <w:r>
-              <w:rPr>
-                <w:rStyle w:val="Hipervnculo"/>
-                <w:noProof/>
-                <w:color w:val="1F497D" w:themeColor="text2"/>
-                <w:lang w:val="es-ES" w:eastAsia="es-ES"/>
-              </w:rPr>
-              <w:t>Propuesta de Valor</w:t>
-            </w:r>
-            <w:r>
-              <w:rPr>
-                <w:noProof/>
-                <w:webHidden/>
-                <w:color w:val="1F497D" w:themeColor="text2"/>
-              </w:rPr>
-              <w:tab/>
-            </w:r>
-            <w:r>
-              <w:rPr>
-                <w:noProof/>
-                <w:webHidden/>
-                <w:color w:val="1F497D" w:themeColor="text2"/>
-              </w:rPr>
-              <w:fldChar w:fldCharType="begin"/>
-            </w:r>
-            <w:r>
-              <w:rPr>
-                <w:noProof/>
-                <w:webHidden/>
-                <w:color w:val="1F497D" w:themeColor="text2"/>
-              </w:rPr>
-              <w:instrText xml:space="preserve"> PAGEREF _Toc241503862 \h </w:instrText>
-            </w:r>
-            <w:r>
-              <w:rPr>
-                <w:noProof/>
-                <w:webHidden/>
-                <w:color w:val="1F497D" w:themeColor="text2"/>
-              </w:rPr>
-            </w:r>
-            <w:r>
-              <w:rPr>
-                <w:noProof/>
-                <w:webHidden/>
-                <w:color w:val="1F497D" w:themeColor="text2"/>
-              </w:rPr>
-              <w:fldChar w:fldCharType="separate"/>
-            </w:r>
-            <w:r>
-              <w:rPr>
-                <w:noProof/>
-                <w:webHidden/>
-                <w:color w:val="1F497D" w:themeColor="text2"/>
-              </w:rPr>
-              <w:t>4</w:t>
-            </w:r>
-            <w:r>
-              <w:rPr>
-                <w:noProof/>
-                <w:webHidden/>
-                <w:color w:val="1F497D" w:themeColor="text2"/>
-              </w:rPr>
-              <w:fldChar w:fldCharType="end"/>
-            </w:r>
-          </w:hyperlink>
-        </w:p>
-        <w:p>
-          <w:pPr>
-            <w:jc w:val="both"/>
-            <w:rPr>
-              <w:rFonts w:cstheme="minorHAnsi"/>
-              <w:color w:val="1F497D" w:themeColor="text2"/>
-              <w:lang w:val="es-ES"/>
-            </w:rPr>
-          </w:pPr>
-          <w:r>
-            <w:rPr>
-              <w:rFonts w:cstheme="minorHAnsi"/>
-              <w:color w:val="1F497D" w:themeColor="text2"/>
-              <w:lang w:val="es-ES"/>
-            </w:rPr>
-            <w:fldChar w:fldCharType="end"/>
-          </w:r>
-        </w:p>
-      </w:sdtContent>
-    </w:sdt>
+    <w:p>
+      <w:pPr>
+        <w:spacing w:after="0"/>
+        <w:jc w:val="both"/>
+        <w:rPr>
+          <w:rFonts w:ascii="Arial" w:hAnsi="Arial" w:cs="Arial"/>
+          <w:color w:val="1F497D" w:themeColor="text2"/>
+          <w:lang w:val="es-ES"/>
+        </w:rPr>
+      </w:pPr>
+      <w:r>
+        <w:rPr>
+          <w:rFonts w:ascii="Arial" w:hAnsi="Arial" w:cs="Arial"/>
+          <w:color w:val="1F497D" w:themeColor="text2"/>
+          <w:lang w:val="es-ES"/>
+        </w:rPr>
+        <w:t>2 Integrantes</w:t>
+      </w:r>
+      <w:r>
+        <w:rPr>
+          <w:rFonts w:ascii="Arial" w:hAnsi="Arial" w:cs="Arial"/>
+          <w:color w:val="1F497D" w:themeColor="text2"/>
+        </w:rPr>
+        <w:t>………………………………………………………………………………………..2</w:t>
+      </w:r>
+    </w:p>
+    <w:p>
+      <w:pPr>
+        <w:spacing w:after="0"/>
+        <w:jc w:val="both"/>
+        <w:rPr>
+          <w:rFonts w:ascii="Arial" w:hAnsi="Arial" w:cs="Arial"/>
+          <w:color w:val="1F497D" w:themeColor="text2"/>
+          <w:lang w:val="es-ES"/>
+        </w:rPr>
+      </w:pPr>
+      <w:r>
+        <w:rPr>
+          <w:rFonts w:ascii="Arial" w:hAnsi="Arial" w:cs="Arial"/>
+          <w:color w:val="1F497D" w:themeColor="text2"/>
+          <w:lang w:val="es-ES"/>
+        </w:rPr>
+        <w:t xml:space="preserve">3 </w:t>
+      </w:r>
+      <w:r>
+        <w:rPr>
+          <w:rFonts w:ascii="Arial" w:hAnsi="Arial" w:cs="Arial"/>
+          <w:color w:val="1F497D" w:themeColor="text2"/>
+          <w:lang w:val="es-ES"/>
+        </w:rPr>
+        <w:t>Product Vision</w:t>
+      </w:r>
+      <w:r>
+        <w:rPr>
+          <w:rFonts w:ascii="Arial" w:hAnsi="Arial" w:cs="Arial"/>
+          <w:color w:val="1F497D" w:themeColor="text2"/>
+        </w:rPr>
+        <w:t>…………………………………………………………………………………….</w:t>
+      </w:r>
+      <w:r>
+        <w:rPr>
+          <w:rFonts w:ascii="Arial" w:hAnsi="Arial" w:cs="Arial"/>
+          <w:color w:val="1F497D" w:themeColor="text2"/>
+        </w:rPr>
+        <w:t>4</w:t>
+      </w:r>
+    </w:p>
+    <w:p>
+      <w:pPr>
+        <w:spacing w:after="0"/>
+        <w:jc w:val="both"/>
+        <w:rPr>
+          <w:rFonts w:ascii="Arial" w:hAnsi="Arial" w:cs="Arial"/>
+          <w:color w:val="1F497D" w:themeColor="text2"/>
+          <w:lang w:val="es-ES"/>
+        </w:rPr>
+      </w:pPr>
+      <w:r>
+        <w:rPr>
+          <w:rFonts w:ascii="Arial" w:hAnsi="Arial" w:cs="Arial"/>
+          <w:color w:val="1F497D" w:themeColor="text2"/>
+          <w:lang w:val="es-ES"/>
+        </w:rPr>
+        <w:tab/>
+        <w:t xml:space="preserve">3.1 </w:t>
+      </w:r>
+      <w:r>
+        <w:rPr>
+          <w:rFonts w:ascii="Arial" w:hAnsi="Arial" w:cs="Arial"/>
+          <w:color w:val="1F497D" w:themeColor="text2"/>
+          <w:lang w:val="es-ES"/>
+        </w:rPr>
+        <w:t>¿Cuál es el problema?........</w:t>
+      </w:r>
+      <w:r>
+        <w:rPr>
+          <w:rFonts w:ascii="Arial" w:hAnsi="Arial" w:cs="Arial"/>
+          <w:color w:val="1F497D" w:themeColor="text2"/>
+        </w:rPr>
+        <w:t>………………………………………………………….4</w:t>
+      </w:r>
+    </w:p>
+    <w:p>
+      <w:pPr>
+        <w:spacing w:after="0"/>
+        <w:jc w:val="both"/>
+        <w:rPr>
+          <w:rFonts w:ascii="Arial" w:hAnsi="Arial" w:cs="Arial"/>
+          <w:color w:val="1F497D" w:themeColor="text2"/>
+          <w:lang w:val="es-ES"/>
+        </w:rPr>
+      </w:pPr>
+      <w:r>
+        <w:rPr>
+          <w:rFonts w:ascii="Arial" w:hAnsi="Arial" w:cs="Arial"/>
+          <w:color w:val="1F497D" w:themeColor="text2"/>
+          <w:lang w:val="es-ES"/>
+        </w:rPr>
+        <w:tab/>
+        <w:t xml:space="preserve">3.2 </w:t>
+      </w:r>
+      <w:r>
+        <w:rPr>
+          <w:rFonts w:ascii="Arial" w:hAnsi="Arial" w:cs="Arial"/>
+          <w:color w:val="1F497D" w:themeColor="text2"/>
+          <w:lang w:val="es-ES"/>
+        </w:rPr>
+        <w:t>Usuarios….</w:t>
+      </w:r>
+      <w:r>
+        <w:rPr>
+          <w:rFonts w:ascii="Arial" w:hAnsi="Arial" w:cs="Arial"/>
+          <w:color w:val="1F497D" w:themeColor="text2"/>
+        </w:rPr>
+        <w:t>……………………………………………………………………………</w:t>
+      </w:r>
+      <w:r>
+        <w:rPr>
+          <w:rFonts w:ascii="Arial" w:hAnsi="Arial" w:cs="Arial"/>
+          <w:color w:val="1F497D" w:themeColor="text2"/>
+        </w:rPr>
+        <w:t>.4</w:t>
+      </w:r>
+    </w:p>
+    <w:p>
+      <w:pPr>
+        <w:spacing w:after="0"/>
+        <w:jc w:val="both"/>
+        <w:rPr>
+          <w:rFonts w:ascii="Arial" w:hAnsi="Arial" w:cs="Arial"/>
+          <w:color w:val="1F497D" w:themeColor="text2"/>
+          <w:lang w:val="es-ES"/>
+        </w:rPr>
+      </w:pPr>
+      <w:r>
+        <w:rPr>
+          <w:rFonts w:ascii="Arial" w:hAnsi="Arial" w:cs="Arial"/>
+          <w:color w:val="1F497D" w:themeColor="text2"/>
+          <w:lang w:val="es-ES"/>
+        </w:rPr>
+        <w:tab/>
+      </w:r>
+      <w:r>
+        <w:rPr>
+          <w:rFonts w:ascii="Arial" w:hAnsi="Arial" w:cs="Arial"/>
+          <w:color w:val="1F497D" w:themeColor="text2"/>
+          <w:lang w:val="es-ES"/>
+        </w:rPr>
+        <w:tab/>
+        <w:t xml:space="preserve">3.2.1 </w:t>
+      </w:r>
+      <w:r>
+        <w:rPr>
+          <w:rFonts w:ascii="Arial" w:hAnsi="Arial" w:cs="Arial"/>
+          <w:color w:val="1F497D" w:themeColor="text2"/>
+          <w:lang w:val="es-ES"/>
+        </w:rPr>
+        <w:t>Psicopedagogo/a……….</w:t>
+      </w:r>
+      <w:r>
+        <w:rPr>
+          <w:rFonts w:ascii="Arial" w:hAnsi="Arial" w:cs="Arial"/>
+          <w:color w:val="1F497D" w:themeColor="text2"/>
+        </w:rPr>
+        <w:t>…..………………………………………………</w:t>
+      </w:r>
+      <w:r>
+        <w:rPr>
+          <w:rFonts w:ascii="Arial" w:hAnsi="Arial" w:cs="Arial"/>
+          <w:color w:val="1F497D" w:themeColor="text2"/>
+        </w:rPr>
+        <w:t>4</w:t>
+      </w:r>
+    </w:p>
+    <w:p>
+      <w:pPr>
+        <w:spacing w:after="0"/>
+        <w:jc w:val="both"/>
+        <w:rPr>
+          <w:rFonts w:ascii="Arial" w:hAnsi="Arial" w:cs="Arial"/>
+          <w:color w:val="1F497D" w:themeColor="text2"/>
+          <w:lang w:val="es-ES"/>
+        </w:rPr>
+      </w:pPr>
+      <w:r>
+        <w:rPr>
+          <w:rFonts w:ascii="Arial" w:hAnsi="Arial" w:cs="Arial"/>
+          <w:color w:val="1F497D" w:themeColor="text2"/>
+          <w:lang w:val="es-ES"/>
+        </w:rPr>
+        <w:tab/>
+      </w:r>
+      <w:r>
+        <w:rPr>
+          <w:rFonts w:ascii="Arial" w:hAnsi="Arial" w:cs="Arial"/>
+          <w:color w:val="1F497D" w:themeColor="text2"/>
+          <w:lang w:val="es-ES"/>
+        </w:rPr>
+        <w:tab/>
+      </w:r>
+      <w:r>
+        <w:rPr>
+          <w:rFonts w:ascii="Arial" w:hAnsi="Arial" w:cs="Arial"/>
+          <w:color w:val="1F497D" w:themeColor="text2"/>
+          <w:lang w:val="es-ES"/>
+        </w:rPr>
+        <w:tab/>
+        <w:t xml:space="preserve">3.2.1.1 </w:t>
+      </w:r>
+      <w:r>
+        <w:rPr>
+          <w:rFonts w:ascii="Arial" w:hAnsi="Arial" w:cs="Arial"/>
+          <w:color w:val="1F497D" w:themeColor="text2"/>
+          <w:lang w:val="es-ES"/>
+        </w:rPr>
+        <w:t>Determinación del usuario………….</w:t>
+      </w:r>
+      <w:r>
+        <w:rPr>
+          <w:rFonts w:ascii="Arial" w:hAnsi="Arial" w:cs="Arial"/>
+          <w:color w:val="1F497D" w:themeColor="text2"/>
+          <w:lang w:val="es-ES"/>
+        </w:rPr>
+        <w:t>…………………………..</w:t>
+      </w:r>
+      <w:r>
+        <w:rPr>
+          <w:rFonts w:ascii="Arial" w:hAnsi="Arial" w:cs="Arial"/>
+          <w:color w:val="1F497D" w:themeColor="text2"/>
+          <w:lang w:val="es-ES"/>
+        </w:rPr>
+        <w:t>4</w:t>
+      </w:r>
+    </w:p>
+    <w:p>
+      <w:pPr>
+        <w:spacing w:after="0"/>
+        <w:jc w:val="both"/>
+        <w:rPr>
+          <w:rFonts w:ascii="Arial" w:hAnsi="Arial" w:cs="Arial"/>
+          <w:color w:val="1F497D" w:themeColor="text2"/>
+          <w:lang w:val="es-ES"/>
+        </w:rPr>
+      </w:pPr>
+      <w:r>
+        <w:rPr>
+          <w:rFonts w:ascii="Arial" w:hAnsi="Arial" w:cs="Arial"/>
+          <w:color w:val="1F497D" w:themeColor="text2"/>
+          <w:lang w:val="es-ES"/>
+        </w:rPr>
+        <w:tab/>
+      </w:r>
+      <w:r>
+        <w:rPr>
+          <w:rFonts w:ascii="Arial" w:hAnsi="Arial" w:cs="Arial"/>
+          <w:color w:val="1F497D" w:themeColor="text2"/>
+          <w:lang w:val="es-ES"/>
+        </w:rPr>
+        <w:tab/>
+      </w:r>
+      <w:r>
+        <w:rPr>
+          <w:rFonts w:ascii="Arial" w:hAnsi="Arial" w:cs="Arial"/>
+          <w:color w:val="1F497D" w:themeColor="text2"/>
+          <w:lang w:val="es-ES"/>
+        </w:rPr>
+        <w:tab/>
+        <w:t>3.2.</w:t>
+      </w:r>
+      <w:r>
+        <w:rPr>
+          <w:rFonts w:ascii="Arial" w:hAnsi="Arial" w:cs="Arial"/>
+          <w:color w:val="1F497D" w:themeColor="text2"/>
+          <w:lang w:val="es-ES"/>
+        </w:rPr>
+        <w:t>1</w:t>
+      </w:r>
+      <w:r>
+        <w:rPr>
+          <w:rFonts w:ascii="Arial" w:hAnsi="Arial" w:cs="Arial"/>
+          <w:color w:val="1F497D" w:themeColor="text2"/>
+          <w:lang w:val="es-ES"/>
+        </w:rPr>
+        <w:t>.</w:t>
+      </w:r>
+      <w:r>
+        <w:rPr>
+          <w:rFonts w:ascii="Arial" w:hAnsi="Arial" w:cs="Arial"/>
+          <w:color w:val="1F497D" w:themeColor="text2"/>
+          <w:lang w:val="es-ES"/>
+        </w:rPr>
+        <w:t>2</w:t>
+      </w:r>
+      <w:r>
+        <w:rPr>
+          <w:rFonts w:ascii="Arial" w:hAnsi="Arial" w:cs="Arial"/>
+          <w:color w:val="1F497D" w:themeColor="text2"/>
+          <w:lang w:val="es-ES"/>
+        </w:rPr>
+        <w:t xml:space="preserve"> </w:t>
+      </w:r>
+      <w:r>
+        <w:rPr>
+          <w:rFonts w:ascii="Arial" w:hAnsi="Arial" w:cs="Arial"/>
+          <w:color w:val="1F497D" w:themeColor="text2"/>
+          <w:lang w:val="es-ES"/>
+        </w:rPr>
+        <w:t>Necesidades de los usuarios….</w:t>
+      </w:r>
+      <w:r>
+        <w:rPr>
+          <w:rFonts w:ascii="Arial" w:hAnsi="Arial" w:cs="Arial"/>
+          <w:color w:val="1F497D" w:themeColor="text2"/>
+          <w:lang w:val="es-ES"/>
+        </w:rPr>
+        <w:t>………………………………..</w:t>
+      </w:r>
+      <w:r>
+        <w:rPr>
+          <w:rFonts w:ascii="Arial" w:hAnsi="Arial" w:cs="Arial"/>
+          <w:color w:val="1F497D" w:themeColor="text2"/>
+          <w:lang w:val="es-ES"/>
+        </w:rPr>
+        <w:t>4</w:t>
+      </w:r>
+    </w:p>
+    <w:p>
+      <w:pPr>
+        <w:spacing w:after="0"/>
+        <w:jc w:val="both"/>
+        <w:rPr>
+          <w:rFonts w:ascii="Arial" w:hAnsi="Arial" w:cs="Arial"/>
+          <w:color w:val="1F497D" w:themeColor="text2"/>
+          <w:lang w:val="es-ES"/>
+        </w:rPr>
+      </w:pPr>
+      <w:r>
+        <w:rPr>
+          <w:rFonts w:ascii="Arial" w:hAnsi="Arial" w:cs="Arial"/>
+          <w:color w:val="1F497D" w:themeColor="text2"/>
+          <w:lang w:val="es-ES"/>
+        </w:rPr>
+        <w:tab/>
+      </w:r>
+      <w:r>
+        <w:rPr>
+          <w:rFonts w:ascii="Arial" w:hAnsi="Arial" w:cs="Arial"/>
+          <w:color w:val="1F497D" w:themeColor="text2"/>
+          <w:lang w:val="es-ES"/>
+        </w:rPr>
+        <w:tab/>
+        <w:t>3.2.</w:t>
+      </w:r>
+      <w:r>
+        <w:rPr>
+          <w:rFonts w:ascii="Arial" w:hAnsi="Arial" w:cs="Arial"/>
+          <w:color w:val="1F497D" w:themeColor="text2"/>
+          <w:lang w:val="es-ES"/>
+        </w:rPr>
+        <w:t>2</w:t>
+      </w:r>
+      <w:r>
+        <w:rPr>
+          <w:rFonts w:ascii="Arial" w:hAnsi="Arial" w:cs="Arial"/>
+          <w:color w:val="1F497D" w:themeColor="text2"/>
+          <w:lang w:val="es-ES"/>
+        </w:rPr>
+        <w:t xml:space="preserve"> </w:t>
+      </w:r>
+      <w:r>
+        <w:rPr>
+          <w:rFonts w:ascii="Arial" w:hAnsi="Arial" w:cs="Arial"/>
+          <w:color w:val="1F497D" w:themeColor="text2"/>
+          <w:lang w:val="es-ES"/>
+        </w:rPr>
+        <w:t>Docente………………...</w:t>
+      </w:r>
+      <w:r>
+        <w:rPr>
+          <w:rFonts w:ascii="Arial" w:hAnsi="Arial" w:cs="Arial"/>
+          <w:color w:val="1F497D" w:themeColor="text2"/>
+          <w:lang w:val="es-ES"/>
+        </w:rPr>
+        <w:t>…………………………………………………</w:t>
+      </w:r>
+      <w:r>
+        <w:rPr>
+          <w:rFonts w:ascii="Arial" w:hAnsi="Arial" w:cs="Arial"/>
+          <w:color w:val="1F497D" w:themeColor="text2"/>
+          <w:lang w:val="es-ES"/>
+        </w:rPr>
+        <w:t>…4</w:t>
+      </w:r>
+    </w:p>
+    <w:p>
+      <w:pPr>
+        <w:spacing w:after="0"/>
+        <w:jc w:val="both"/>
+        <w:rPr>
+          <w:rFonts w:ascii="Arial" w:hAnsi="Arial" w:cs="Arial"/>
+          <w:color w:val="1F497D" w:themeColor="text2"/>
+          <w:lang w:val="es-ES"/>
+        </w:rPr>
+      </w:pPr>
+      <w:r>
+        <w:rPr>
+          <w:rFonts w:ascii="Arial" w:hAnsi="Arial" w:cs="Arial"/>
+          <w:color w:val="1F497D" w:themeColor="text2"/>
+          <w:lang w:val="es-ES"/>
+        </w:rPr>
+        <w:tab/>
+      </w:r>
+      <w:r>
+        <w:rPr>
+          <w:rFonts w:ascii="Arial" w:hAnsi="Arial" w:cs="Arial"/>
+          <w:color w:val="1F497D" w:themeColor="text2"/>
+          <w:lang w:val="es-ES"/>
+        </w:rPr>
+        <w:tab/>
+      </w:r>
+      <w:r>
+        <w:rPr>
+          <w:rFonts w:ascii="Arial" w:hAnsi="Arial" w:cs="Arial"/>
+          <w:color w:val="1F497D" w:themeColor="text2"/>
+          <w:lang w:val="es-ES"/>
+        </w:rPr>
+        <w:tab/>
+        <w:t>3.2.</w:t>
+      </w:r>
+      <w:r>
+        <w:rPr>
+          <w:rFonts w:ascii="Arial" w:hAnsi="Arial" w:cs="Arial"/>
+          <w:color w:val="1F497D" w:themeColor="text2"/>
+          <w:lang w:val="es-ES"/>
+        </w:rPr>
+        <w:t>2</w:t>
+      </w:r>
+      <w:r>
+        <w:rPr>
+          <w:rFonts w:ascii="Arial" w:hAnsi="Arial" w:cs="Arial"/>
+          <w:color w:val="1F497D" w:themeColor="text2"/>
+          <w:lang w:val="es-ES"/>
+        </w:rPr>
+        <w:t xml:space="preserve">.1 </w:t>
+      </w:r>
+      <w:r>
+        <w:rPr>
+          <w:rFonts w:ascii="Arial" w:hAnsi="Arial" w:cs="Arial"/>
+          <w:color w:val="1F497D" w:themeColor="text2"/>
+          <w:lang w:val="es-ES"/>
+        </w:rPr>
+        <w:t>Determinación del usuario………….</w:t>
+      </w:r>
+      <w:r>
+        <w:rPr>
+          <w:rFonts w:ascii="Arial" w:hAnsi="Arial" w:cs="Arial"/>
+          <w:color w:val="1F497D" w:themeColor="text2"/>
+          <w:lang w:val="es-ES"/>
+        </w:rPr>
+        <w:t>…………………………..</w:t>
+      </w:r>
+      <w:r>
+        <w:rPr>
+          <w:rFonts w:ascii="Arial" w:hAnsi="Arial" w:cs="Arial"/>
+          <w:color w:val="1F497D" w:themeColor="text2"/>
+          <w:lang w:val="es-ES"/>
+        </w:rPr>
+        <w:t>4</w:t>
+      </w:r>
+    </w:p>
+    <w:p>
+      <w:pPr>
+        <w:spacing w:after="0"/>
+        <w:jc w:val="both"/>
+        <w:rPr>
+          <w:rFonts w:ascii="Arial" w:hAnsi="Arial" w:cs="Arial"/>
+          <w:color w:val="1F497D" w:themeColor="text2"/>
+          <w:lang w:val="es-ES"/>
+        </w:rPr>
+      </w:pPr>
+      <w:r>
+        <w:rPr>
+          <w:rFonts w:ascii="Arial" w:hAnsi="Arial" w:cs="Arial"/>
+          <w:color w:val="1F497D" w:themeColor="text2"/>
+          <w:lang w:val="es-ES"/>
+        </w:rPr>
+        <w:tab/>
+      </w:r>
+      <w:r>
+        <w:rPr>
+          <w:rFonts w:ascii="Arial" w:hAnsi="Arial" w:cs="Arial"/>
+          <w:color w:val="1F497D" w:themeColor="text2"/>
+          <w:lang w:val="es-ES"/>
+        </w:rPr>
+        <w:tab/>
+      </w:r>
+      <w:r>
+        <w:rPr>
+          <w:rFonts w:ascii="Arial" w:hAnsi="Arial" w:cs="Arial"/>
+          <w:color w:val="1F497D" w:themeColor="text2"/>
+          <w:lang w:val="es-ES"/>
+        </w:rPr>
+        <w:tab/>
+        <w:t>3.2.</w:t>
+      </w:r>
+      <w:r>
+        <w:rPr>
+          <w:rFonts w:ascii="Arial" w:hAnsi="Arial" w:cs="Arial"/>
+          <w:color w:val="1F497D" w:themeColor="text2"/>
+          <w:lang w:val="es-ES"/>
+        </w:rPr>
+        <w:t>2</w:t>
+      </w:r>
+      <w:r>
+        <w:rPr>
+          <w:rFonts w:ascii="Arial" w:hAnsi="Arial" w:cs="Arial"/>
+          <w:color w:val="1F497D" w:themeColor="text2"/>
+          <w:lang w:val="es-ES"/>
+        </w:rPr>
+        <w:t>.</w:t>
+      </w:r>
+      <w:r>
+        <w:rPr>
+          <w:rFonts w:ascii="Arial" w:hAnsi="Arial" w:cs="Arial"/>
+          <w:color w:val="1F497D" w:themeColor="text2"/>
+          <w:lang w:val="es-ES"/>
+        </w:rPr>
+        <w:t>2</w:t>
+      </w:r>
+      <w:r>
+        <w:rPr>
+          <w:rFonts w:ascii="Arial" w:hAnsi="Arial" w:cs="Arial"/>
+          <w:color w:val="1F497D" w:themeColor="text2"/>
+          <w:lang w:val="es-ES"/>
+        </w:rPr>
+        <w:t xml:space="preserve"> </w:t>
+      </w:r>
+      <w:r>
+        <w:rPr>
+          <w:rFonts w:ascii="Arial" w:hAnsi="Arial" w:cs="Arial"/>
+          <w:color w:val="1F497D" w:themeColor="text2"/>
+          <w:lang w:val="es-ES"/>
+        </w:rPr>
+        <w:t>Necesidades de los usuarios….</w:t>
+      </w:r>
+      <w:r>
+        <w:rPr>
+          <w:rFonts w:ascii="Arial" w:hAnsi="Arial" w:cs="Arial"/>
+          <w:color w:val="1F497D" w:themeColor="text2"/>
+          <w:lang w:val="es-ES"/>
+        </w:rPr>
+        <w:t>……………………………….</w:t>
+      </w:r>
+      <w:r>
+        <w:rPr>
+          <w:rFonts w:ascii="Arial" w:hAnsi="Arial" w:cs="Arial"/>
+          <w:color w:val="1F497D" w:themeColor="text2"/>
+          <w:lang w:val="es-ES"/>
+        </w:rPr>
+        <w:t>.5</w:t>
+      </w:r>
+    </w:p>
+    <w:p>
+      <w:pPr>
+        <w:spacing w:after="0"/>
+        <w:jc w:val="both"/>
+        <w:rPr>
+          <w:rFonts w:ascii="Arial" w:hAnsi="Arial" w:cs="Arial"/>
+          <w:color w:val="1F497D" w:themeColor="text2"/>
+          <w:lang w:val="es-ES"/>
+        </w:rPr>
+      </w:pPr>
+      <w:r>
+        <w:rPr>
+          <w:rFonts w:ascii="Arial" w:hAnsi="Arial" w:cs="Arial"/>
+          <w:color w:val="1F497D" w:themeColor="text2"/>
+          <w:lang w:val="es-ES"/>
+        </w:rPr>
+        <w:tab/>
+      </w:r>
+      <w:r>
+        <w:rPr>
+          <w:rFonts w:ascii="Arial" w:hAnsi="Arial" w:cs="Arial"/>
+          <w:color w:val="1F497D" w:themeColor="text2"/>
+          <w:lang w:val="es-ES"/>
+        </w:rPr>
+        <w:tab/>
+        <w:t>3.2.</w:t>
+      </w:r>
+      <w:r>
+        <w:rPr>
+          <w:rFonts w:ascii="Arial" w:hAnsi="Arial" w:cs="Arial"/>
+          <w:color w:val="1F497D" w:themeColor="text2"/>
+          <w:lang w:val="es-ES"/>
+        </w:rPr>
+        <w:t>3</w:t>
+      </w:r>
+      <w:r>
+        <w:rPr>
+          <w:rFonts w:ascii="Arial" w:hAnsi="Arial" w:cs="Arial"/>
+          <w:color w:val="1F497D" w:themeColor="text2"/>
+          <w:lang w:val="es-ES"/>
+        </w:rPr>
+        <w:t xml:space="preserve"> </w:t>
+      </w:r>
+      <w:r>
+        <w:rPr>
+          <w:rFonts w:ascii="Arial" w:hAnsi="Arial" w:cs="Arial"/>
+          <w:color w:val="1F497D" w:themeColor="text2"/>
+          <w:lang w:val="es-ES"/>
+        </w:rPr>
+        <w:t>Equipo de gestión del establecimiento…..</w:t>
+      </w:r>
+      <w:r>
+        <w:rPr>
+          <w:rFonts w:ascii="Arial" w:hAnsi="Arial" w:cs="Arial"/>
+          <w:color w:val="1F497D" w:themeColor="text2"/>
+          <w:lang w:val="es-ES"/>
+        </w:rPr>
+        <w:t>……………………………</w:t>
+      </w:r>
+      <w:r>
+        <w:rPr>
+          <w:rFonts w:ascii="Arial" w:hAnsi="Arial" w:cs="Arial"/>
+          <w:color w:val="1F497D" w:themeColor="text2"/>
+          <w:lang w:val="es-ES"/>
+        </w:rPr>
+        <w:t>…</w:t>
+      </w:r>
+      <w:r>
+        <w:rPr>
+          <w:rFonts w:ascii="Arial" w:hAnsi="Arial" w:cs="Arial"/>
+          <w:color w:val="1F497D" w:themeColor="text2"/>
+          <w:lang w:val="es-ES"/>
+        </w:rPr>
+        <w:t>.5</w:t>
+      </w:r>
+    </w:p>
+    <w:p>
+      <w:pPr>
+        <w:spacing w:after="0"/>
+        <w:jc w:val="both"/>
+        <w:rPr>
+          <w:rFonts w:ascii="Arial" w:hAnsi="Arial" w:cs="Arial"/>
+          <w:color w:val="1F497D" w:themeColor="text2"/>
+          <w:lang w:val="es-ES"/>
+        </w:rPr>
+      </w:pPr>
+      <w:r>
+        <w:rPr>
+          <w:rFonts w:ascii="Arial" w:hAnsi="Arial" w:cs="Arial"/>
+          <w:color w:val="1F497D" w:themeColor="text2"/>
+          <w:lang w:val="es-ES"/>
+        </w:rPr>
+        <w:tab/>
+      </w:r>
+      <w:r>
+        <w:rPr>
+          <w:rFonts w:ascii="Arial" w:hAnsi="Arial" w:cs="Arial"/>
+          <w:color w:val="1F497D" w:themeColor="text2"/>
+          <w:lang w:val="es-ES"/>
+        </w:rPr>
+        <w:tab/>
+      </w:r>
+      <w:r>
+        <w:rPr>
+          <w:rFonts w:ascii="Arial" w:hAnsi="Arial" w:cs="Arial"/>
+          <w:color w:val="1F497D" w:themeColor="text2"/>
+          <w:lang w:val="es-ES"/>
+        </w:rPr>
+        <w:tab/>
+        <w:t>3.2.</w:t>
+      </w:r>
+      <w:r>
+        <w:rPr>
+          <w:rFonts w:ascii="Arial" w:hAnsi="Arial" w:cs="Arial"/>
+          <w:color w:val="1F497D" w:themeColor="text2"/>
+          <w:lang w:val="es-ES"/>
+        </w:rPr>
+        <w:t>3</w:t>
+      </w:r>
+      <w:r>
+        <w:rPr>
+          <w:rFonts w:ascii="Arial" w:hAnsi="Arial" w:cs="Arial"/>
+          <w:color w:val="1F497D" w:themeColor="text2"/>
+          <w:lang w:val="es-ES"/>
+        </w:rPr>
+        <w:t xml:space="preserve">.1 </w:t>
+      </w:r>
+      <w:r>
+        <w:rPr>
+          <w:rFonts w:ascii="Arial" w:hAnsi="Arial" w:cs="Arial"/>
+          <w:color w:val="1F497D" w:themeColor="text2"/>
+          <w:lang w:val="es-ES"/>
+        </w:rPr>
+        <w:t>Determinación del usuario………….</w:t>
+      </w:r>
+      <w:r>
+        <w:rPr>
+          <w:rFonts w:ascii="Arial" w:hAnsi="Arial" w:cs="Arial"/>
+          <w:color w:val="1F497D" w:themeColor="text2"/>
+          <w:lang w:val="es-ES"/>
+        </w:rPr>
+        <w:t>…………………………..</w:t>
+      </w:r>
+      <w:r>
+        <w:rPr>
+          <w:rFonts w:ascii="Arial" w:hAnsi="Arial" w:cs="Arial"/>
+          <w:color w:val="1F497D" w:themeColor="text2"/>
+          <w:lang w:val="es-ES"/>
+        </w:rPr>
+        <w:t>5</w:t>
+      </w:r>
+    </w:p>
+    <w:p>
+      <w:pPr>
+        <w:spacing w:after="0"/>
+        <w:jc w:val="both"/>
+        <w:rPr>
+          <w:rFonts w:ascii="Arial" w:hAnsi="Arial" w:cs="Arial"/>
+          <w:color w:val="1F497D" w:themeColor="text2"/>
+          <w:lang w:val="es-ES"/>
+        </w:rPr>
+      </w:pPr>
+      <w:r>
+        <w:rPr>
+          <w:rFonts w:ascii="Arial" w:hAnsi="Arial" w:cs="Arial"/>
+          <w:color w:val="1F497D" w:themeColor="text2"/>
+          <w:lang w:val="es-ES"/>
+        </w:rPr>
+        <w:tab/>
+      </w:r>
+      <w:r>
+        <w:rPr>
+          <w:rFonts w:ascii="Arial" w:hAnsi="Arial" w:cs="Arial"/>
+          <w:color w:val="1F497D" w:themeColor="text2"/>
+          <w:lang w:val="es-ES"/>
+        </w:rPr>
+        <w:tab/>
+      </w:r>
+      <w:r>
+        <w:rPr>
+          <w:rFonts w:ascii="Arial" w:hAnsi="Arial" w:cs="Arial"/>
+          <w:color w:val="1F497D" w:themeColor="text2"/>
+          <w:lang w:val="es-ES"/>
+        </w:rPr>
+        <w:tab/>
+        <w:t>3.2.</w:t>
+      </w:r>
+      <w:r>
+        <w:rPr>
+          <w:rFonts w:ascii="Arial" w:hAnsi="Arial" w:cs="Arial"/>
+          <w:color w:val="1F497D" w:themeColor="text2"/>
+          <w:lang w:val="es-ES"/>
+        </w:rPr>
+        <w:t>3</w:t>
+      </w:r>
+      <w:r>
+        <w:rPr>
+          <w:rFonts w:ascii="Arial" w:hAnsi="Arial" w:cs="Arial"/>
+          <w:color w:val="1F497D" w:themeColor="text2"/>
+          <w:lang w:val="es-ES"/>
+        </w:rPr>
+        <w:t>.</w:t>
+      </w:r>
+      <w:r>
+        <w:rPr>
+          <w:rFonts w:ascii="Arial" w:hAnsi="Arial" w:cs="Arial"/>
+          <w:color w:val="1F497D" w:themeColor="text2"/>
+          <w:lang w:val="es-ES"/>
+        </w:rPr>
+        <w:t>2</w:t>
+      </w:r>
+      <w:r>
+        <w:rPr>
+          <w:rFonts w:ascii="Arial" w:hAnsi="Arial" w:cs="Arial"/>
+          <w:color w:val="1F497D" w:themeColor="text2"/>
+          <w:lang w:val="es-ES"/>
+        </w:rPr>
+        <w:t xml:space="preserve"> </w:t>
+      </w:r>
+      <w:r>
+        <w:rPr>
+          <w:rFonts w:ascii="Arial" w:hAnsi="Arial" w:cs="Arial"/>
+          <w:color w:val="1F497D" w:themeColor="text2"/>
+          <w:lang w:val="es-ES"/>
+        </w:rPr>
+        <w:t>Necesidades de los usuarios….</w:t>
+      </w:r>
+      <w:r>
+        <w:rPr>
+          <w:rFonts w:ascii="Arial" w:hAnsi="Arial" w:cs="Arial"/>
+          <w:color w:val="1F497D" w:themeColor="text2"/>
+          <w:lang w:val="es-ES"/>
+        </w:rPr>
+        <w:t>……………………………….</w:t>
+      </w:r>
+      <w:r>
+        <w:rPr>
+          <w:rFonts w:ascii="Arial" w:hAnsi="Arial" w:cs="Arial"/>
+          <w:color w:val="1F497D" w:themeColor="text2"/>
+          <w:lang w:val="es-ES"/>
+        </w:rPr>
+        <w:t>.5</w:t>
+      </w:r>
+    </w:p>
+    <w:p>
+      <w:pPr>
+        <w:spacing w:after="0"/>
+        <w:jc w:val="both"/>
+        <w:rPr>
+          <w:rFonts w:ascii="Arial" w:hAnsi="Arial" w:cs="Arial"/>
+          <w:color w:val="1F497D" w:themeColor="text2"/>
+          <w:lang w:val="es-ES"/>
+        </w:rPr>
+      </w:pPr>
+      <w:r>
+        <w:rPr>
+          <w:rFonts w:ascii="Arial" w:hAnsi="Arial" w:cs="Arial"/>
+          <w:color w:val="1F497D" w:themeColor="text2"/>
+          <w:lang w:val="es-ES"/>
+        </w:rPr>
+        <w:tab/>
+        <w:t xml:space="preserve">3.3 </w:t>
+      </w:r>
+      <w:r>
+        <w:rPr>
+          <w:rFonts w:ascii="Arial" w:hAnsi="Arial" w:cs="Arial"/>
+          <w:color w:val="1F497D" w:themeColor="text2"/>
+          <w:lang w:val="es-ES"/>
+        </w:rPr>
+        <w:t>Propuesta de Valor………</w:t>
+      </w:r>
+      <w:r>
+        <w:rPr>
+          <w:rFonts w:ascii="Arial" w:hAnsi="Arial" w:cs="Arial"/>
+          <w:color w:val="1F497D" w:themeColor="text2"/>
+          <w:lang w:val="es-ES"/>
+        </w:rPr>
+        <w:t>…………………………………………………………</w:t>
+      </w:r>
+      <w:r>
+        <w:rPr>
+          <w:rFonts w:ascii="Arial" w:hAnsi="Arial" w:cs="Arial"/>
+          <w:color w:val="1F497D" w:themeColor="text2"/>
+          <w:lang w:val="es-ES"/>
+        </w:rPr>
+        <w:t>…5</w:t>
+      </w:r>
+    </w:p>
+    <w:p>
+      <w:pPr>
+        <w:jc w:val="both"/>
+        <w:rPr>
+          <w:rFonts w:ascii="Arial" w:hAnsi="Arial" w:cs="Arial"/>
+          <w:color w:val="1F497D" w:themeColor="text2"/>
+          <w:lang w:val="es-ES"/>
+        </w:rPr>
+      </w:pPr>
+    </w:p>
     <w:p>
       <w:pPr>
         <w:pStyle w:val="Ttulo1"/>
         <w:jc w:val="both"/>
         <w:rPr>
-          <w:rFonts w:asciiTheme="minorHAnsi" w:eastAsia="Times New Roman" w:hAnsiTheme="minorHAnsi" w:cstheme="minorHAnsi"/>
+          <w:rFonts w:ascii="Arial" w:eastAsia="Times New Roman" w:hAnsi="Arial" w:cs="Arial"/>
           <w:color w:val="1F497D" w:themeColor="text2"/>
           <w:kern w:val="32"/>
         </w:rPr>
@@ -1600,7 +1426,7 @@
       <w:bookmarkStart w:id="1" w:name="_Toc241503854"/>
       <w:r>
         <w:rPr>
-          <w:rFonts w:asciiTheme="minorHAnsi" w:eastAsia="Times New Roman" w:hAnsiTheme="minorHAnsi" w:cstheme="minorHAnsi"/>
+          <w:rFonts w:ascii="Arial" w:eastAsia="Times New Roman" w:hAnsi="Arial" w:cs="Arial"/>
           <w:color w:val="1F497D" w:themeColor="text2"/>
           <w:kern w:val="32"/>
         </w:rPr>
@@ -1614,7 +1440,7 @@
         <w:spacing w:after="0" w:line="240" w:lineRule="auto"/>
         <w:jc w:val="both"/>
         <w:rPr>
-          <w:rFonts w:eastAsia="Times New Roman" w:cstheme="minorHAnsi"/>
+          <w:rFonts w:ascii="Arial" w:eastAsia="Times New Roman" w:hAnsi="Arial" w:cs="Arial"/>
           <w:color w:val="1F497D" w:themeColor="text2"/>
           <w:sz w:val="20"/>
           <w:szCs w:val="24"/>
@@ -1627,7 +1453,7 @@
         <w:spacing w:after="0" w:line="240" w:lineRule="auto"/>
         <w:jc w:val="both"/>
         <w:rPr>
-          <w:rFonts w:eastAsia="Times New Roman" w:cstheme="minorHAnsi"/>
+          <w:rFonts w:ascii="Arial" w:eastAsia="Times New Roman" w:hAnsi="Arial" w:cs="Arial"/>
           <w:color w:val="1F497D" w:themeColor="text2"/>
           <w:sz w:val="20"/>
           <w:szCs w:val="24"/>
@@ -1883,7 +1709,7 @@
         <w:spacing w:after="0" w:line="240" w:lineRule="auto"/>
         <w:jc w:val="both"/>
         <w:rPr>
-          <w:rFonts w:eastAsia="Times New Roman" w:cstheme="minorHAnsi"/>
+          <w:rFonts w:ascii="Arial" w:eastAsia="Times New Roman" w:hAnsi="Arial" w:cs="Arial"/>
           <w:color w:val="1F497D" w:themeColor="text2"/>
           <w:sz w:val="20"/>
           <w:szCs w:val="24"/>
@@ -1896,7 +1722,7 @@
         <w:spacing w:after="0" w:line="240" w:lineRule="auto"/>
         <w:jc w:val="both"/>
         <w:rPr>
-          <w:rFonts w:eastAsia="Times New Roman" w:cstheme="minorHAnsi"/>
+          <w:rFonts w:ascii="Arial" w:eastAsia="Times New Roman" w:hAnsi="Arial" w:cs="Arial"/>
           <w:color w:val="1F497D" w:themeColor="text2"/>
           <w:sz w:val="20"/>
           <w:szCs w:val="24"/>
@@ -1909,7 +1735,7 @@
         <w:spacing w:after="0" w:line="240" w:lineRule="auto"/>
         <w:jc w:val="both"/>
         <w:rPr>
-          <w:rFonts w:eastAsia="Times New Roman" w:cstheme="minorHAnsi"/>
+          <w:rFonts w:ascii="Arial" w:eastAsia="Times New Roman" w:hAnsi="Arial" w:cs="Arial"/>
           <w:color w:val="1F497D" w:themeColor="text2"/>
           <w:sz w:val="20"/>
           <w:szCs w:val="24"/>
@@ -1922,7 +1748,7 @@
         <w:spacing w:after="0" w:line="240" w:lineRule="auto"/>
         <w:jc w:val="both"/>
         <w:rPr>
-          <w:rFonts w:eastAsia="Times New Roman" w:cstheme="minorHAnsi"/>
+          <w:rFonts w:ascii="Arial" w:eastAsia="Times New Roman" w:hAnsi="Arial" w:cs="Arial"/>
           <w:color w:val="1F497D" w:themeColor="text2"/>
           <w:sz w:val="20"/>
           <w:szCs w:val="24"/>
@@ -1931,7 +1757,7 @@
       </w:pPr>
       <w:r>
         <w:rPr>
-          <w:rFonts w:eastAsia="Times New Roman" w:cstheme="minorHAnsi"/>
+          <w:rFonts w:ascii="Arial" w:eastAsia="Times New Roman" w:hAnsi="Arial" w:cs="Arial"/>
           <w:color w:val="1F497D" w:themeColor="text2"/>
           <w:sz w:val="20"/>
           <w:szCs w:val="24"/>
@@ -1941,7 +1767,7 @@
       </w:r>
       <w:r>
         <w:rPr>
-          <w:rFonts w:eastAsia="Times New Roman" w:cstheme="minorHAnsi"/>
+          <w:rFonts w:ascii="Arial" w:eastAsia="Times New Roman" w:hAnsi="Arial" w:cs="Arial"/>
           <w:color w:val="1F497D" w:themeColor="text2"/>
           <w:sz w:val="20"/>
           <w:szCs w:val="24"/>
@@ -1955,7 +1781,7 @@
         <w:spacing w:after="0" w:line="240" w:lineRule="auto"/>
         <w:jc w:val="both"/>
         <w:rPr>
-          <w:rFonts w:eastAsia="Times New Roman" w:cstheme="minorHAnsi"/>
+          <w:rFonts w:ascii="Arial" w:eastAsia="Times New Roman" w:hAnsi="Arial" w:cs="Arial"/>
           <w:color w:val="1F497D" w:themeColor="text2"/>
           <w:sz w:val="20"/>
           <w:szCs w:val="24"/>
@@ -1968,7 +1794,7 @@
         <w:spacing w:after="0" w:line="240" w:lineRule="auto"/>
         <w:jc w:val="both"/>
         <w:rPr>
-          <w:rFonts w:eastAsia="Times New Roman" w:cstheme="minorHAnsi"/>
+          <w:rFonts w:ascii="Arial" w:eastAsia="Times New Roman" w:hAnsi="Arial" w:cs="Arial"/>
           <w:color w:val="1F497D" w:themeColor="text2"/>
           <w:sz w:val="20"/>
           <w:szCs w:val="24"/>
@@ -1981,7 +1807,7 @@
         <w:spacing w:after="0" w:line="240" w:lineRule="auto"/>
         <w:jc w:val="both"/>
         <w:rPr>
-          <w:rFonts w:eastAsia="Times New Roman" w:cstheme="minorHAnsi"/>
+          <w:rFonts w:ascii="Arial" w:eastAsia="Times New Roman" w:hAnsi="Arial" w:cs="Arial"/>
           <w:color w:val="1F497D" w:themeColor="text2"/>
           <w:sz w:val="20"/>
           <w:szCs w:val="24"/>
@@ -1993,12 +1819,14 @@
       <w:pPr>
         <w:pStyle w:val="Ttulo1"/>
         <w:rPr>
+          <w:rFonts w:ascii="Arial" w:hAnsi="Arial" w:cs="Arial"/>
           <w:color w:val="1F497D" w:themeColor="text2"/>
         </w:rPr>
       </w:pPr>
       <w:bookmarkStart w:id="2" w:name="_Toc241503855"/>
       <w:r>
         <w:rPr>
+          <w:rFonts w:ascii="Arial" w:hAnsi="Arial" w:cs="Arial"/>
           <w:color w:val="1F497D" w:themeColor="text2"/>
         </w:rPr>
         <w:t>Integrantes:</w:t>
@@ -2784,6 +2612,7 @@
     <w:p>
       <w:pPr>
         <w:rPr>
+          <w:rFonts w:ascii="Arial" w:hAnsi="Arial" w:cs="Arial"/>
           <w:color w:val="1F497D" w:themeColor="text2"/>
         </w:rPr>
       </w:pPr>
@@ -2792,7 +2621,7 @@
       <w:pPr>
         <w:jc w:val="both"/>
         <w:rPr>
-          <w:rFonts w:eastAsiaTheme="majorEastAsia" w:cstheme="minorHAnsi"/>
+          <w:rFonts w:ascii="Arial" w:eastAsiaTheme="majorEastAsia" w:hAnsi="Arial" w:cs="Arial"/>
           <w:b/>
           <w:bCs/>
           <w:color w:val="1F497D" w:themeColor="text2"/>
@@ -2802,7 +2631,7 @@
       </w:pPr>
       <w:r>
         <w:rPr>
-          <w:rFonts w:cstheme="minorHAnsi"/>
+          <w:rFonts w:ascii="Arial" w:hAnsi="Arial" w:cs="Arial"/>
           <w:color w:val="1F497D" w:themeColor="text2"/>
         </w:rPr>
         <w:br w:type="page"/>
@@ -2813,18 +2642,18 @@
         <w:pStyle w:val="Ttulo1"/>
         <w:jc w:val="both"/>
         <w:rPr>
-          <w:rFonts w:asciiTheme="minorHAnsi" w:hAnsiTheme="minorHAnsi" w:cstheme="minorHAnsi"/>
+          <w:rFonts w:ascii="Arial" w:hAnsi="Arial" w:cs="Arial"/>
           <w:color w:val="1F497D" w:themeColor="text2"/>
         </w:rPr>
       </w:pPr>
       <w:bookmarkStart w:id="3" w:name="_Toc241503856"/>
       <w:r>
         <w:rPr>
-          <w:rFonts w:asciiTheme="minorHAnsi" w:hAnsiTheme="minorHAnsi" w:cstheme="minorHAnsi"/>
+          <w:rFonts w:ascii="Arial" w:hAnsi="Arial" w:cs="Arial"/>
           <w:color w:val="1F497D" w:themeColor="text2"/>
         </w:rPr>
         <w:lastRenderedPageBreak/>
-        <w:t>Producto Vision</w:t>
+        <w:t>Product Vision</w:t>
       </w:r>
       <w:bookmarkEnd w:id="3"/>
     </w:p>
@@ -2833,14 +2662,14 @@
         <w:pStyle w:val="Ttulo2"/>
         <w:jc w:val="both"/>
         <w:rPr>
-          <w:rFonts w:asciiTheme="minorHAnsi" w:hAnsiTheme="minorHAnsi" w:cstheme="minorHAnsi"/>
+          <w:rFonts w:ascii="Arial" w:hAnsi="Arial" w:cs="Arial"/>
           <w:color w:val="1F497D" w:themeColor="text2"/>
         </w:rPr>
       </w:pPr>
       <w:bookmarkStart w:id="4" w:name="_Toc241503857"/>
       <w:r>
         <w:rPr>
-          <w:rFonts w:asciiTheme="minorHAnsi" w:hAnsiTheme="minorHAnsi" w:cstheme="minorHAnsi"/>
+          <w:rFonts w:ascii="Arial" w:hAnsi="Arial" w:cs="Arial"/>
           <w:color w:val="1F497D" w:themeColor="text2"/>
         </w:rPr>
         <w:t>¿Cuál es el problema?</w:t>
@@ -2852,7 +2681,7 @@
         <w:pStyle w:val="isselectedend"/>
         <w:ind w:firstLine="576"/>
         <w:rPr>
-          <w:rFonts w:asciiTheme="minorHAnsi" w:hAnsiTheme="minorHAnsi" w:cstheme="minorHAnsi"/>
+          <w:rFonts w:ascii="Arial" w:hAnsi="Arial" w:cs="Arial"/>
           <w:color w:val="1F497D" w:themeColor="text2"/>
           <w:sz w:val="22"/>
           <w:szCs w:val="22"/>
@@ -2861,7 +2690,7 @@
       <w:bookmarkStart w:id="5" w:name="_Toc241503858"/>
       <w:r>
         <w:rPr>
-          <w:rFonts w:asciiTheme="minorHAnsi" w:hAnsiTheme="minorHAnsi" w:cstheme="minorHAnsi"/>
+          <w:rFonts w:ascii="Arial" w:hAnsi="Arial" w:cs="Arial"/>
           <w:color w:val="1F497D" w:themeColor="text2"/>
           <w:sz w:val="22"/>
           <w:szCs w:val="22"/>
@@ -2874,7 +2703,7 @@
         <w:pStyle w:val="isselectedend"/>
         <w:ind w:firstLine="576"/>
         <w:rPr>
-          <w:rFonts w:asciiTheme="minorHAnsi" w:hAnsiTheme="minorHAnsi" w:cstheme="minorHAnsi"/>
+          <w:rFonts w:ascii="Arial" w:hAnsi="Arial" w:cs="Arial"/>
           <w:color w:val="1F497D" w:themeColor="text2"/>
           <w:sz w:val="22"/>
           <w:szCs w:val="22"/>
@@ -2882,7 +2711,7 @@
       </w:pPr>
       <w:r>
         <w:rPr>
-          <w:rFonts w:asciiTheme="minorHAnsi" w:hAnsiTheme="minorHAnsi" w:cstheme="minorHAnsi"/>
+          <w:rFonts w:ascii="Arial" w:hAnsi="Arial" w:cs="Arial"/>
           <w:color w:val="1F497D" w:themeColor="text2"/>
           <w:sz w:val="22"/>
           <w:szCs w:val="22"/>
@@ -2895,7 +2724,7 @@
         <w:pStyle w:val="NormalWeb"/>
         <w:ind w:firstLine="576"/>
         <w:rPr>
-          <w:rFonts w:asciiTheme="minorHAnsi" w:hAnsiTheme="minorHAnsi" w:cstheme="minorHAnsi"/>
+          <w:rFonts w:ascii="Arial" w:hAnsi="Arial" w:cs="Arial"/>
           <w:color w:val="1F497D" w:themeColor="text2"/>
           <w:sz w:val="22"/>
           <w:szCs w:val="22"/>
@@ -2903,7 +2732,7 @@
       </w:pPr>
       <w:r>
         <w:rPr>
-          <w:rFonts w:asciiTheme="minorHAnsi" w:hAnsiTheme="minorHAnsi" w:cstheme="minorHAnsi"/>
+          <w:rFonts w:ascii="Arial" w:hAnsi="Arial" w:cs="Arial"/>
           <w:color w:val="1F497D" w:themeColor="text2"/>
           <w:sz w:val="22"/>
           <w:szCs w:val="22"/>
@@ -2915,11 +2744,13 @@
       <w:pPr>
         <w:pStyle w:val="Ttulo2"/>
         <w:rPr>
-          <w:color w:val="1F497D" w:themeColor="text2"/>
-        </w:rPr>
-      </w:pPr>
-      <w:r>
-        <w:rPr>
+          <w:rFonts w:ascii="Arial" w:hAnsi="Arial" w:cs="Arial"/>
+          <w:color w:val="1F497D" w:themeColor="text2"/>
+        </w:rPr>
+      </w:pPr>
+      <w:r>
+        <w:rPr>
+          <w:rFonts w:ascii="Arial" w:hAnsi="Arial" w:cs="Arial"/>
           <w:color w:val="1F497D" w:themeColor="text2"/>
         </w:rPr>
         <w:t>Usuarios</w:t>
@@ -2930,11 +2761,13 @@
       <w:pPr>
         <w:pStyle w:val="Ttulo3"/>
         <w:rPr>
-          <w:color w:val="1F497D" w:themeColor="text2"/>
-        </w:rPr>
-      </w:pPr>
-      <w:r>
-        <w:rPr>
+          <w:rFonts w:ascii="Arial" w:hAnsi="Arial"/>
+          <w:color w:val="1F497D" w:themeColor="text2"/>
+        </w:rPr>
+      </w:pPr>
+      <w:r>
+        <w:rPr>
+          <w:rFonts w:ascii="Arial" w:hAnsi="Arial"/>
           <w:color w:val="1F497D" w:themeColor="text2"/>
         </w:rPr>
         <w:t>Psicopedagogo/a</w:t>
@@ -2944,11 +2777,21 @@
       <w:pPr>
         <w:pStyle w:val="Ttulo4"/>
         <w:rPr>
-          <w:color w:val="1F497D" w:themeColor="text2"/>
-        </w:rPr>
-      </w:pPr>
-      <w:r>
-        <w:rPr>
+          <w:rFonts w:ascii="Arial" w:hAnsi="Arial" w:cs="Arial"/>
+          <w:b/>
+          <w:bCs/>
+          <w:i w:val="0"/>
+          <w:iCs w:val="0"/>
+          <w:color w:val="1F497D" w:themeColor="text2"/>
+        </w:rPr>
+      </w:pPr>
+      <w:r>
+        <w:rPr>
+          <w:rFonts w:ascii="Arial" w:hAnsi="Arial" w:cs="Arial"/>
+          <w:b/>
+          <w:bCs/>
+          <w:i w:val="0"/>
+          <w:iCs w:val="0"/>
           <w:color w:val="1F497D" w:themeColor="text2"/>
         </w:rPr>
         <w:t>Determinación del usuario</w:t>
@@ -2958,12 +2801,14 @@
       <w:pPr>
         <w:ind w:firstLine="708"/>
         <w:rPr>
+          <w:rFonts w:ascii="Arial" w:hAnsi="Arial" w:cs="Arial"/>
           <w:color w:val="1F497D" w:themeColor="text2"/>
           <w:lang w:val="es-ES" w:eastAsia="es-ES"/>
         </w:rPr>
       </w:pPr>
       <w:r>
         <w:rPr>
+          <w:rFonts w:ascii="Arial" w:hAnsi="Arial" w:cs="Arial"/>
           <w:color w:val="1F497D" w:themeColor="text2"/>
           <w:lang w:val="es-ES" w:eastAsia="es-ES"/>
         </w:rPr>
@@ -2974,12 +2819,14 @@
       <w:pPr>
         <w:ind w:firstLine="708"/>
         <w:rPr>
+          <w:rFonts w:ascii="Arial" w:hAnsi="Arial" w:cs="Arial"/>
           <w:color w:val="1F497D" w:themeColor="text2"/>
           <w:lang w:val="es-ES" w:eastAsia="es-ES"/>
         </w:rPr>
       </w:pPr>
       <w:r>
         <w:rPr>
+          <w:rFonts w:ascii="Arial" w:hAnsi="Arial" w:cs="Arial"/>
           <w:color w:val="1F497D" w:themeColor="text2"/>
           <w:lang w:val="es-ES" w:eastAsia="es-ES"/>
         </w:rPr>
@@ -2990,12 +2837,22 @@
       <w:pPr>
         <w:pStyle w:val="Ttulo4"/>
         <w:rPr>
+          <w:rFonts w:ascii="Arial" w:hAnsi="Arial" w:cs="Arial"/>
+          <w:b/>
+          <w:bCs/>
+          <w:i w:val="0"/>
+          <w:iCs w:val="0"/>
           <w:color w:val="1F497D" w:themeColor="text2"/>
           <w:lang w:val="es-ES" w:eastAsia="es-ES"/>
         </w:rPr>
       </w:pPr>
       <w:r>
         <w:rPr>
+          <w:rFonts w:ascii="Arial" w:hAnsi="Arial" w:cs="Arial"/>
+          <w:b/>
+          <w:bCs/>
+          <w:i w:val="0"/>
+          <w:iCs w:val="0"/>
           <w:color w:val="1F497D" w:themeColor="text2"/>
           <w:lang w:val="es-ES" w:eastAsia="es-ES"/>
         </w:rPr>
@@ -3006,6 +2863,7 @@
       <w:pPr>
         <w:ind w:firstLine="708"/>
         <w:rPr>
+          <w:rFonts w:ascii="Arial" w:hAnsi="Arial" w:cs="Arial"/>
           <w:color w:val="1F497D" w:themeColor="text2"/>
           <w:u w:val="single"/>
           <w:lang w:val="es-ES" w:eastAsia="es-ES"/>
@@ -3013,6 +2871,7 @@
       </w:pPr>
       <w:r>
         <w:rPr>
+          <w:rFonts w:ascii="Arial" w:hAnsi="Arial" w:cs="Arial"/>
           <w:color w:val="1F497D" w:themeColor="text2"/>
           <w:lang w:val="es-ES" w:eastAsia="es-ES"/>
         </w:rPr>
@@ -3023,11 +2882,13 @@
       <w:pPr>
         <w:pStyle w:val="Ttulo3"/>
         <w:rPr>
-          <w:color w:val="1F497D" w:themeColor="text2"/>
-        </w:rPr>
-      </w:pPr>
-      <w:r>
-        <w:rPr>
+          <w:rFonts w:ascii="Arial" w:hAnsi="Arial"/>
+          <w:color w:val="1F497D" w:themeColor="text2"/>
+        </w:rPr>
+      </w:pPr>
+      <w:r>
+        <w:rPr>
+          <w:rFonts w:ascii="Arial" w:hAnsi="Arial"/>
           <w:color w:val="1F497D" w:themeColor="text2"/>
         </w:rPr>
         <w:t>Docente</w:t>
@@ -3037,11 +2898,21 @@
       <w:pPr>
         <w:pStyle w:val="Ttulo4"/>
         <w:rPr>
-          <w:color w:val="1F497D" w:themeColor="text2"/>
-        </w:rPr>
-      </w:pPr>
-      <w:r>
-        <w:rPr>
+          <w:rFonts w:ascii="Arial" w:hAnsi="Arial" w:cs="Arial"/>
+          <w:b/>
+          <w:bCs/>
+          <w:i w:val="0"/>
+          <w:iCs w:val="0"/>
+          <w:color w:val="1F497D" w:themeColor="text2"/>
+        </w:rPr>
+      </w:pPr>
+      <w:r>
+        <w:rPr>
+          <w:rFonts w:ascii="Arial" w:hAnsi="Arial" w:cs="Arial"/>
+          <w:b/>
+          <w:bCs/>
+          <w:i w:val="0"/>
+          <w:iCs w:val="0"/>
           <w:color w:val="1F497D" w:themeColor="text2"/>
         </w:rPr>
         <w:t>Determinación del usuario</w:t>
@@ -3051,12 +2922,14 @@
       <w:pPr>
         <w:ind w:firstLine="708"/>
         <w:rPr>
+          <w:rFonts w:ascii="Arial" w:hAnsi="Arial" w:cs="Arial"/>
           <w:color w:val="1F497D" w:themeColor="text2"/>
           <w:lang w:val="es-ES" w:eastAsia="es-ES"/>
         </w:rPr>
       </w:pPr>
       <w:r>
         <w:rPr>
+          <w:rFonts w:ascii="Arial" w:hAnsi="Arial" w:cs="Arial"/>
           <w:color w:val="1F497D" w:themeColor="text2"/>
           <w:lang w:val="es-ES" w:eastAsia="es-ES"/>
         </w:rPr>
@@ -3067,12 +2940,14 @@
       <w:pPr>
         <w:ind w:firstLine="708"/>
         <w:rPr>
+          <w:rFonts w:ascii="Arial" w:hAnsi="Arial" w:cs="Arial"/>
           <w:color w:val="1F497D" w:themeColor="text2"/>
           <w:lang w:val="es-ES" w:eastAsia="es-ES"/>
         </w:rPr>
       </w:pPr>
       <w:r>
         <w:rPr>
+          <w:rFonts w:ascii="Arial" w:hAnsi="Arial" w:cs="Arial"/>
           <w:color w:val="1F497D" w:themeColor="text2"/>
           <w:lang w:val="es-ES" w:eastAsia="es-ES"/>
         </w:rPr>
@@ -3084,12 +2959,22 @@
       <w:pPr>
         <w:pStyle w:val="Ttulo4"/>
         <w:rPr>
+          <w:rFonts w:ascii="Arial" w:hAnsi="Arial" w:cs="Arial"/>
+          <w:b/>
+          <w:bCs/>
+          <w:i w:val="0"/>
+          <w:iCs w:val="0"/>
           <w:color w:val="1F497D" w:themeColor="text2"/>
           <w:lang w:val="es-ES" w:eastAsia="es-ES"/>
         </w:rPr>
       </w:pPr>
       <w:r>
         <w:rPr>
+          <w:rFonts w:ascii="Arial" w:hAnsi="Arial" w:cs="Arial"/>
+          <w:b/>
+          <w:bCs/>
+          <w:i w:val="0"/>
+          <w:iCs w:val="0"/>
           <w:color w:val="1F497D" w:themeColor="text2"/>
           <w:lang w:val="es-ES" w:eastAsia="es-ES"/>
         </w:rPr>
@@ -3100,12 +2985,14 @@
       <w:pPr>
         <w:ind w:firstLine="708"/>
         <w:rPr>
+          <w:rFonts w:ascii="Arial" w:hAnsi="Arial" w:cs="Arial"/>
           <w:color w:val="1F497D" w:themeColor="text2"/>
           <w:lang w:val="es-ES" w:eastAsia="es-ES"/>
         </w:rPr>
       </w:pPr>
       <w:r>
         <w:rPr>
+          <w:rFonts w:ascii="Arial" w:hAnsi="Arial" w:cs="Arial"/>
           <w:color w:val="1F497D" w:themeColor="text2"/>
           <w:lang w:val="es-ES" w:eastAsia="es-ES"/>
         </w:rPr>
@@ -3116,11 +3003,13 @@
       <w:pPr>
         <w:pStyle w:val="Ttulo3"/>
         <w:rPr>
-          <w:color w:val="1F497D" w:themeColor="text2"/>
-        </w:rPr>
-      </w:pPr>
-      <w:r>
-        <w:rPr>
+          <w:rFonts w:ascii="Arial" w:hAnsi="Arial"/>
+          <w:color w:val="1F497D" w:themeColor="text2"/>
+        </w:rPr>
+      </w:pPr>
+      <w:r>
+        <w:rPr>
+          <w:rFonts w:ascii="Arial" w:hAnsi="Arial"/>
           <w:color w:val="1F497D" w:themeColor="text2"/>
         </w:rPr>
         <w:t>Equipo de gestión del establecimiento</w:t>
@@ -3130,11 +3019,21 @@
       <w:pPr>
         <w:pStyle w:val="Ttulo4"/>
         <w:rPr>
-          <w:color w:val="1F497D" w:themeColor="text2"/>
-        </w:rPr>
-      </w:pPr>
-      <w:r>
-        <w:rPr>
+          <w:rFonts w:ascii="Arial" w:hAnsi="Arial" w:cs="Arial"/>
+          <w:b/>
+          <w:bCs/>
+          <w:i w:val="0"/>
+          <w:iCs w:val="0"/>
+          <w:color w:val="1F497D" w:themeColor="text2"/>
+        </w:rPr>
+      </w:pPr>
+      <w:r>
+        <w:rPr>
+          <w:rFonts w:ascii="Arial" w:hAnsi="Arial" w:cs="Arial"/>
+          <w:b/>
+          <w:bCs/>
+          <w:i w:val="0"/>
+          <w:iCs w:val="0"/>
           <w:color w:val="1F497D" w:themeColor="text2"/>
         </w:rPr>
         <w:t>Determinación del usuario</w:t>
@@ -3144,12 +3043,14 @@
       <w:pPr>
         <w:ind w:firstLine="708"/>
         <w:rPr>
+          <w:rFonts w:ascii="Arial" w:hAnsi="Arial" w:cs="Arial"/>
           <w:color w:val="1F497D" w:themeColor="text2"/>
           <w:lang w:val="es-ES" w:eastAsia="es-ES"/>
         </w:rPr>
       </w:pPr>
       <w:r>
         <w:rPr>
+          <w:rFonts w:ascii="Arial" w:hAnsi="Arial" w:cs="Arial"/>
           <w:color w:val="1F497D" w:themeColor="text2"/>
           <w:lang w:val="es-ES" w:eastAsia="es-ES"/>
         </w:rPr>
@@ -3160,12 +3061,22 @@
       <w:pPr>
         <w:pStyle w:val="Ttulo4"/>
         <w:rPr>
+          <w:rFonts w:ascii="Arial" w:hAnsi="Arial" w:cs="Arial"/>
+          <w:b/>
+          <w:bCs/>
+          <w:i w:val="0"/>
+          <w:iCs w:val="0"/>
           <w:color w:val="1F497D" w:themeColor="text2"/>
           <w:lang w:val="es-ES" w:eastAsia="es-ES"/>
         </w:rPr>
       </w:pPr>
       <w:r>
         <w:rPr>
+          <w:rFonts w:ascii="Arial" w:hAnsi="Arial" w:cs="Arial"/>
+          <w:b/>
+          <w:bCs/>
+          <w:i w:val="0"/>
+          <w:iCs w:val="0"/>
           <w:color w:val="1F497D" w:themeColor="text2"/>
           <w:lang w:val="es-ES" w:eastAsia="es-ES"/>
         </w:rPr>
@@ -3176,12 +3087,14 @@
       <w:pPr>
         <w:ind w:firstLine="576"/>
         <w:rPr>
+          <w:rFonts w:ascii="Arial" w:hAnsi="Arial" w:cs="Arial"/>
           <w:color w:val="1F497D" w:themeColor="text2"/>
           <w:lang w:val="es-ES" w:eastAsia="es-ES"/>
         </w:rPr>
       </w:pPr>
       <w:r>
         <w:rPr>
+          <w:rFonts w:ascii="Arial" w:hAnsi="Arial" w:cs="Arial"/>
           <w:color w:val="1F497D" w:themeColor="text2"/>
           <w:lang w:val="es-ES" w:eastAsia="es-ES"/>
         </w:rPr>
@@ -3191,6 +3104,7 @@
     <w:p>
       <w:pPr>
         <w:rPr>
+          <w:rFonts w:ascii="Arial" w:hAnsi="Arial" w:cs="Arial"/>
           <w:color w:val="1F497D" w:themeColor="text2"/>
           <w:lang w:val="es-ES" w:eastAsia="es-ES"/>
         </w:rPr>
@@ -3200,6 +3114,7 @@
       <w:pPr>
         <w:pStyle w:val="Ttulo2"/>
         <w:rPr>
+          <w:rFonts w:ascii="Arial" w:hAnsi="Arial" w:cs="Arial"/>
           <w:color w:val="1F497D" w:themeColor="text2"/>
           <w:lang w:val="es-ES" w:eastAsia="es-ES"/>
         </w:rPr>
@@ -3207,6 +3122,7 @@
       <w:bookmarkStart w:id="6" w:name="_Toc241503862"/>
       <w:r>
         <w:rPr>
+          <w:rFonts w:ascii="Arial" w:hAnsi="Arial" w:cs="Arial"/>
           <w:color w:val="1F497D" w:themeColor="text2"/>
           <w:lang w:val="es-ES" w:eastAsia="es-ES"/>
         </w:rPr>
@@ -3217,12 +3133,14 @@
     <w:p>
       <w:pPr>
         <w:rPr>
+          <w:rFonts w:ascii="Arial" w:hAnsi="Arial" w:cs="Arial"/>
           <w:color w:val="1F497D" w:themeColor="text2"/>
           <w:lang w:val="es-ES" w:eastAsia="es-ES"/>
         </w:rPr>
       </w:pPr>
       <w:r>
         <w:rPr>
+          <w:rFonts w:ascii="Arial" w:hAnsi="Arial" w:cs="Arial"/>
           <w:color w:val="1F497D" w:themeColor="text2"/>
           <w:lang w:val="es-ES" w:eastAsia="es-ES"/>
         </w:rPr>
@@ -3230,6 +3148,7 @@
       </w:r>
       <w:r>
         <w:rPr>
+          <w:rFonts w:ascii="Arial" w:hAnsi="Arial" w:cs="Arial"/>
           <w:color w:val="1F497D" w:themeColor="text2"/>
           <w:lang w:val="es-ES" w:eastAsia="es-ES"/>
         </w:rPr>
@@ -3237,6 +3156,7 @@
       </w:r>
       <w:r>
         <w:rPr>
+          <w:rFonts w:ascii="Arial" w:hAnsi="Arial" w:cs="Arial"/>
           <w:color w:val="1F497D" w:themeColor="text2"/>
           <w:lang w:val="es-ES" w:eastAsia="es-ES"/>
         </w:rPr>
@@ -3244,6 +3164,7 @@
       </w:r>
       <w:r>
         <w:rPr>
+          <w:rFonts w:ascii="Arial" w:hAnsi="Arial" w:cs="Arial"/>
           <w:color w:val="1F497D" w:themeColor="text2"/>
           <w:lang w:val="es-ES" w:eastAsia="es-ES"/>
         </w:rPr>
@@ -3253,12 +3174,14 @@
     <w:p>
       <w:pPr>
         <w:rPr>
+          <w:rFonts w:ascii="Arial" w:hAnsi="Arial" w:cs="Arial"/>
           <w:color w:val="1F497D" w:themeColor="text2"/>
           <w:lang w:val="es-ES" w:eastAsia="es-ES"/>
         </w:rPr>
       </w:pPr>
       <w:r>
         <w:rPr>
+          <w:rFonts w:ascii="Arial" w:hAnsi="Arial" w:cs="Arial"/>
           <w:color w:val="1F497D" w:themeColor="text2"/>
           <w:lang w:val="es-ES" w:eastAsia="es-ES"/>
         </w:rPr>
@@ -3266,6 +3189,7 @@
       </w:r>
       <w:r>
         <w:rPr>
+          <w:rFonts w:ascii="Arial" w:hAnsi="Arial" w:cs="Arial"/>
           <w:color w:val="1F497D" w:themeColor="text2"/>
           <w:lang w:val="es-ES" w:eastAsia="es-ES"/>
         </w:rPr>
@@ -3273,6 +3197,7 @@
       </w:r>
       <w:r>
         <w:rPr>
+          <w:rFonts w:ascii="Arial" w:hAnsi="Arial" w:cs="Arial"/>
           <w:color w:val="1F497D" w:themeColor="text2"/>
           <w:lang w:val="es-ES" w:eastAsia="es-ES"/>
         </w:rPr>
@@ -3282,12 +3207,14 @@
     <w:p>
       <w:pPr>
         <w:rPr>
+          <w:rFonts w:ascii="Arial" w:hAnsi="Arial" w:cs="Arial"/>
           <w:color w:val="1F497D" w:themeColor="text2"/>
           <w:lang w:val="es-ES" w:eastAsia="es-ES"/>
         </w:rPr>
       </w:pPr>
       <w:r>
         <w:rPr>
+          <w:rFonts w:ascii="Arial" w:hAnsi="Arial" w:cs="Arial"/>
           <w:color w:val="1F497D" w:themeColor="text2"/>
           <w:lang w:val="es-ES" w:eastAsia="es-ES"/>
         </w:rPr>
@@ -3295,6 +3222,7 @@
       </w:r>
       <w:r>
         <w:rPr>
+          <w:rFonts w:ascii="Arial" w:hAnsi="Arial" w:cs="Arial"/>
           <w:color w:val="1F497D" w:themeColor="text2"/>
           <w:lang w:val="es-ES" w:eastAsia="es-ES"/>
         </w:rPr>
@@ -3302,6 +3230,7 @@
       </w:r>
       <w:r>
         <w:rPr>
+          <w:rFonts w:ascii="Arial" w:hAnsi="Arial" w:cs="Arial"/>
           <w:color w:val="1F497D" w:themeColor="text2"/>
           <w:lang w:val="es-ES" w:eastAsia="es-ES"/>
         </w:rPr>
@@ -3309,6 +3238,7 @@
       </w:r>
       <w:r>
         <w:rPr>
+          <w:rFonts w:ascii="Arial" w:hAnsi="Arial" w:cs="Arial"/>
           <w:color w:val="1F497D" w:themeColor="text2"/>
           <w:lang w:val="es-ES" w:eastAsia="es-ES"/>
         </w:rPr>
@@ -3316,6 +3246,7 @@
       </w:r>
       <w:r>
         <w:rPr>
+          <w:rFonts w:ascii="Arial" w:hAnsi="Arial" w:cs="Arial"/>
           <w:color w:val="1F497D" w:themeColor="text2"/>
           <w:lang w:val="es-ES" w:eastAsia="es-ES"/>
         </w:rPr>
@@ -3325,12 +3256,14 @@
     <w:p>
       <w:pPr>
         <w:rPr>
+          <w:rFonts w:ascii="Arial" w:hAnsi="Arial" w:cs="Arial"/>
           <w:color w:val="1F497D" w:themeColor="text2"/>
           <w:lang w:val="es-ES" w:eastAsia="es-ES"/>
         </w:rPr>
       </w:pPr>
       <w:r>
         <w:rPr>
+          <w:rFonts w:ascii="Arial" w:hAnsi="Arial" w:cs="Arial"/>
           <w:color w:val="1F497D" w:themeColor="text2"/>
           <w:lang w:val="es-ES" w:eastAsia="es-ES"/>
         </w:rPr>
@@ -3338,6 +3271,7 @@
       </w:r>
       <w:r>
         <w:rPr>
+          <w:rFonts w:ascii="Arial" w:hAnsi="Arial" w:cs="Arial"/>
           <w:color w:val="1F497D" w:themeColor="text2"/>
           <w:lang w:val="es-ES" w:eastAsia="es-ES"/>
         </w:rPr>
@@ -3473,16 +3407,8 @@
       <w:rPr>
         <w:color w:val="17365D" w:themeColor="text2" w:themeShade="BF"/>
       </w:rPr>
-      <w:t xml:space="preserve">Product </w:t>
+      <w:t>Product vision</w:t>
     </w:r>
-    <w:proofErr w:type="spellStart"/>
-    <w:r>
-      <w:rPr>
-        <w:color w:val="17365D" w:themeColor="text2" w:themeShade="BF"/>
-      </w:rPr>
-      <w:t>vision</w:t>
-    </w:r>
-    <w:proofErr w:type="spellEnd"/>
   </w:p>
   <w:p>
     <w:pPr>
@@ -5689,7 +5615,6 @@
   <w:style w:type="character" w:default="1" w:styleId="Fuentedeprrafopredeter">
     <w:name w:val="Default Paragraph Font"/>
     <w:uiPriority w:val="1"/>
-    <w:semiHidden/>
     <w:unhideWhenUsed/>
   </w:style>
   <w:style w:type="table" w:default="1" w:styleId="Tablanormal">
@@ -5865,7 +5790,6 @@
     <w:basedOn w:val="Ttulo1"/>
     <w:next w:val="Normal"/>
     <w:uiPriority w:val="39"/>
-    <w:semiHidden/>
     <w:unhideWhenUsed/>
     <w:qFormat/>
     <w:rsid w:val="00C82195"/>
@@ -6517,6 +6441,7 @@
     <w:rsid w:val="000609BA"/>
     <w:rsid w:val="00194DF5"/>
     <w:rsid w:val="001B14B7"/>
+    <w:rsid w:val="001C09EB"/>
     <w:rsid w:val="00220B95"/>
     <w:rsid w:val="00230D02"/>
     <w:rsid w:val="00252686"/>
@@ -6524,7 +6449,9 @@
     <w:rsid w:val="002C06A7"/>
     <w:rsid w:val="00390D4D"/>
     <w:rsid w:val="003F408D"/>
+    <w:rsid w:val="004152AA"/>
     <w:rsid w:val="004F7F49"/>
+    <w:rsid w:val="00564650"/>
     <w:rsid w:val="0057410B"/>
     <w:rsid w:val="00595623"/>
     <w:rsid w:val="005B27DB"/>
@@ -6545,6 +6472,7 @@
     <w:rsid w:val="00DB5568"/>
     <w:rsid w:val="00DD693D"/>
     <w:rsid w:val="00E068BB"/>
+    <w:rsid w:val="00E7578D"/>
     <w:rsid w:val="00EC21D5"/>
   </w:rsids>
   <m:mathPr>

</xml_diff>